<commit_message>
Livrable L3 : mise à jour du document de passation
Co-Authored-By: Claude Opus 4.8 <noreply@anthropic.com>
</commit_message>
<xml_diff>
--- a/livrables/L3-documentation-de-passation/L3 - Documentation de passation - NEOTRAVEL.docx
+++ b/livrables/L3-documentation-de-passation/L3 - Documentation de passation - NEOTRAVEL.docx
@@ -829,7 +829,7 @@
         </w:rPr>
         <w:fldChar w:fldCharType="separate"/>
       </w:r>
-      <w:hyperlink w:anchor="_Toc233659535" w:history="1">
+      <w:hyperlink w:anchor="_Toc233660835" w:history="1">
         <w:r>
           <w:rPr>
             <w:rStyle w:val="Lienhypertexte"/>
@@ -875,7 +875,7 @@
             <w:noProof/>
             <w:webHidden/>
           </w:rPr>
-          <w:instrText xml:space="preserve"> PAGEREF _Toc233659535 \h </w:instrText>
+          <w:instrText xml:space="preserve"> PAGEREF _Toc233660835 \h </w:instrText>
         </w:r>
         <w:r>
           <w:rPr>
@@ -921,7 +921,7 @@
           <w14:ligatures w14:val="standardContextual"/>
         </w:rPr>
       </w:pPr>
-      <w:hyperlink w:anchor="_Toc233659536" w:history="1">
+      <w:hyperlink w:anchor="_Toc233660836" w:history="1">
         <w:r>
           <w:rPr>
             <w:rStyle w:val="Lienhypertexte"/>
@@ -965,7 +965,7 @@
             <w:noProof/>
             <w:webHidden/>
           </w:rPr>
-          <w:instrText xml:space="preserve"> PAGEREF _Toc233659536 \h </w:instrText>
+          <w:instrText xml:space="preserve"> PAGEREF _Toc233660836 \h </w:instrText>
         </w:r>
         <w:r>
           <w:rPr>
@@ -1011,7 +1011,7 @@
           <w14:ligatures w14:val="standardContextual"/>
         </w:rPr>
       </w:pPr>
-      <w:hyperlink w:anchor="_Toc233659537" w:history="1">
+      <w:hyperlink w:anchor="_Toc233660837" w:history="1">
         <w:r>
           <w:rPr>
             <w:rStyle w:val="Lienhypertexte"/>
@@ -1057,7 +1057,7 @@
             <w:noProof/>
             <w:webHidden/>
           </w:rPr>
-          <w:instrText xml:space="preserve"> PAGEREF _Toc233659537 \h </w:instrText>
+          <w:instrText xml:space="preserve"> PAGEREF _Toc233660837 \h </w:instrText>
         </w:r>
         <w:r>
           <w:rPr>
@@ -1103,7 +1103,7 @@
           <w14:ligatures w14:val="standardContextual"/>
         </w:rPr>
       </w:pPr>
-      <w:hyperlink w:anchor="_Toc233659538" w:history="1">
+      <w:hyperlink w:anchor="_Toc233660838" w:history="1">
         <w:r>
           <w:rPr>
             <w:rStyle w:val="Lienhypertexte"/>
@@ -1149,7 +1149,7 @@
             <w:noProof/>
             <w:webHidden/>
           </w:rPr>
-          <w:instrText xml:space="preserve"> PAGEREF _Toc233659538 \h </w:instrText>
+          <w:instrText xml:space="preserve"> PAGEREF _Toc233660838 \h </w:instrText>
         </w:r>
         <w:r>
           <w:rPr>
@@ -1195,7 +1195,7 @@
           <w14:ligatures w14:val="standardContextual"/>
         </w:rPr>
       </w:pPr>
-      <w:hyperlink w:anchor="_Toc233659539" w:history="1">
+      <w:hyperlink w:anchor="_Toc233660839" w:history="1">
         <w:r>
           <w:rPr>
             <w:rStyle w:val="Lienhypertexte"/>
@@ -1241,7 +1241,7 @@
             <w:noProof/>
             <w:webHidden/>
           </w:rPr>
-          <w:instrText xml:space="preserve"> PAGEREF _Toc233659539 \h </w:instrText>
+          <w:instrText xml:space="preserve"> PAGEREF _Toc233660839 \h </w:instrText>
         </w:r>
         <w:r>
           <w:rPr>
@@ -1287,7 +1287,7 @@
           <w14:ligatures w14:val="standardContextual"/>
         </w:rPr>
       </w:pPr>
-      <w:hyperlink w:anchor="_Toc233659540" w:history="1">
+      <w:hyperlink w:anchor="_Toc233660840" w:history="1">
         <w:r>
           <w:rPr>
             <w:rStyle w:val="Lienhypertexte"/>
@@ -1333,7 +1333,7 @@
             <w:noProof/>
             <w:webHidden/>
           </w:rPr>
-          <w:instrText xml:space="preserve"> PAGEREF _Toc233659540 \h </w:instrText>
+          <w:instrText xml:space="preserve"> PAGEREF _Toc233660840 \h </w:instrText>
         </w:r>
         <w:r>
           <w:rPr>
@@ -1379,7 +1379,7 @@
           <w14:ligatures w14:val="standardContextual"/>
         </w:rPr>
       </w:pPr>
-      <w:hyperlink w:anchor="_Toc233659541" w:history="1">
+      <w:hyperlink w:anchor="_Toc233660841" w:history="1">
         <w:r>
           <w:rPr>
             <w:rStyle w:val="Lienhypertexte"/>
@@ -1425,7 +1425,7 @@
             <w:noProof/>
             <w:webHidden/>
           </w:rPr>
-          <w:instrText xml:space="preserve"> PAGEREF _Toc233659541 \h </w:instrText>
+          <w:instrText xml:space="preserve"> PAGEREF _Toc233660841 \h </w:instrText>
         </w:r>
         <w:r>
           <w:rPr>
@@ -1471,7 +1471,7 @@
           <w14:ligatures w14:val="standardContextual"/>
         </w:rPr>
       </w:pPr>
-      <w:hyperlink w:anchor="_Toc233659542" w:history="1">
+      <w:hyperlink w:anchor="_Toc233660842" w:history="1">
         <w:r>
           <w:rPr>
             <w:rStyle w:val="Lienhypertexte"/>
@@ -1517,7 +1517,7 @@
             <w:noProof/>
             <w:webHidden/>
           </w:rPr>
-          <w:instrText xml:space="preserve"> PAGEREF _Toc233659542 \h </w:instrText>
+          <w:instrText xml:space="preserve"> PAGEREF _Toc233660842 \h </w:instrText>
         </w:r>
         <w:r>
           <w:rPr>
@@ -1563,7 +1563,7 @@
           <w14:ligatures w14:val="standardContextual"/>
         </w:rPr>
       </w:pPr>
-      <w:hyperlink w:anchor="_Toc233659543" w:history="1">
+      <w:hyperlink w:anchor="_Toc233660843" w:history="1">
         <w:r>
           <w:rPr>
             <w:rStyle w:val="Lienhypertexte"/>
@@ -1609,7 +1609,7 @@
             <w:noProof/>
             <w:webHidden/>
           </w:rPr>
-          <w:instrText xml:space="preserve"> PAGEREF _Toc233659543 \h </w:instrText>
+          <w:instrText xml:space="preserve"> PAGEREF _Toc233660843 \h </w:instrText>
         </w:r>
         <w:r>
           <w:rPr>
@@ -1655,7 +1655,7 @@
           <w14:ligatures w14:val="standardContextual"/>
         </w:rPr>
       </w:pPr>
-      <w:hyperlink w:anchor="_Toc233659544" w:history="1">
+      <w:hyperlink w:anchor="_Toc233660844" w:history="1">
         <w:r>
           <w:rPr>
             <w:rStyle w:val="Lienhypertexte"/>
@@ -1701,7 +1701,7 @@
             <w:noProof/>
             <w:webHidden/>
           </w:rPr>
-          <w:instrText xml:space="preserve"> PAGEREF _Toc233659544 \h </w:instrText>
+          <w:instrText xml:space="preserve"> PAGEREF _Toc233660844 \h </w:instrText>
         </w:r>
         <w:r>
           <w:rPr>
@@ -1747,7 +1747,7 @@
           <w14:ligatures w14:val="standardContextual"/>
         </w:rPr>
       </w:pPr>
-      <w:hyperlink w:anchor="_Toc233659545" w:history="1">
+      <w:hyperlink w:anchor="_Toc233660845" w:history="1">
         <w:r>
           <w:rPr>
             <w:rStyle w:val="Lienhypertexte"/>
@@ -1793,7 +1793,7 @@
             <w:noProof/>
             <w:webHidden/>
           </w:rPr>
-          <w:instrText xml:space="preserve"> PAGEREF _Toc233659545 \h </w:instrText>
+          <w:instrText xml:space="preserve"> PAGEREF _Toc233660845 \h </w:instrText>
         </w:r>
         <w:r>
           <w:rPr>
@@ -1839,7 +1839,7 @@
           <w14:ligatures w14:val="standardContextual"/>
         </w:rPr>
       </w:pPr>
-      <w:hyperlink w:anchor="_Toc233659546" w:history="1">
+      <w:hyperlink w:anchor="_Toc233660846" w:history="1">
         <w:r>
           <w:rPr>
             <w:rStyle w:val="Lienhypertexte"/>
@@ -1885,7 +1885,7 @@
             <w:noProof/>
             <w:webHidden/>
           </w:rPr>
-          <w:instrText xml:space="preserve"> PAGEREF _Toc233659546 \h </w:instrText>
+          <w:instrText xml:space="preserve"> PAGEREF _Toc233660846 \h </w:instrText>
         </w:r>
         <w:r>
           <w:rPr>
@@ -1931,7 +1931,7 @@
           <w14:ligatures w14:val="standardContextual"/>
         </w:rPr>
       </w:pPr>
-      <w:hyperlink w:anchor="_Toc233659547" w:history="1">
+      <w:hyperlink w:anchor="_Toc233660847" w:history="1">
         <w:r>
           <w:rPr>
             <w:rStyle w:val="Lienhypertexte"/>
@@ -1977,7 +1977,7 @@
             <w:noProof/>
             <w:webHidden/>
           </w:rPr>
-          <w:instrText xml:space="preserve"> PAGEREF _Toc233659547 \h </w:instrText>
+          <w:instrText xml:space="preserve"> PAGEREF _Toc233660847 \h </w:instrText>
         </w:r>
         <w:r>
           <w:rPr>
@@ -2023,7 +2023,7 @@
           <w14:ligatures w14:val="standardContextual"/>
         </w:rPr>
       </w:pPr>
-      <w:hyperlink w:anchor="_Toc233659548" w:history="1">
+      <w:hyperlink w:anchor="_Toc233660848" w:history="1">
         <w:r>
           <w:rPr>
             <w:rStyle w:val="Lienhypertexte"/>
@@ -2069,7 +2069,7 @@
             <w:noProof/>
             <w:webHidden/>
           </w:rPr>
-          <w:instrText xml:space="preserve"> PAGEREF _Toc233659548 \h </w:instrText>
+          <w:instrText xml:space="preserve"> PAGEREF _Toc233660848 \h </w:instrText>
         </w:r>
         <w:r>
           <w:rPr>
@@ -2115,7 +2115,7 @@
           <w14:ligatures w14:val="standardContextual"/>
         </w:rPr>
       </w:pPr>
-      <w:hyperlink w:anchor="_Toc233659549" w:history="1">
+      <w:hyperlink w:anchor="_Toc233660849" w:history="1">
         <w:r>
           <w:rPr>
             <w:rStyle w:val="Lienhypertexte"/>
@@ -2161,7 +2161,7 @@
             <w:noProof/>
             <w:webHidden/>
           </w:rPr>
-          <w:instrText xml:space="preserve"> PAGEREF _Toc233659549 \h </w:instrText>
+          <w:instrText xml:space="preserve"> PAGEREF _Toc233660849 \h </w:instrText>
         </w:r>
         <w:r>
           <w:rPr>
@@ -2207,7 +2207,7 @@
           <w14:ligatures w14:val="standardContextual"/>
         </w:rPr>
       </w:pPr>
-      <w:hyperlink w:anchor="_Toc233659550" w:history="1">
+      <w:hyperlink w:anchor="_Toc233660850" w:history="1">
         <w:r>
           <w:rPr>
             <w:rStyle w:val="Lienhypertexte"/>
@@ -2253,7 +2253,7 @@
             <w:noProof/>
             <w:webHidden/>
           </w:rPr>
-          <w:instrText xml:space="preserve"> PAGEREF _Toc233659550 \h </w:instrText>
+          <w:instrText xml:space="preserve"> PAGEREF _Toc233660850 \h </w:instrText>
         </w:r>
         <w:r>
           <w:rPr>
@@ -2299,7 +2299,7 @@
           <w14:ligatures w14:val="standardContextual"/>
         </w:rPr>
       </w:pPr>
-      <w:hyperlink w:anchor="_Toc233659551" w:history="1">
+      <w:hyperlink w:anchor="_Toc233660851" w:history="1">
         <w:r>
           <w:rPr>
             <w:rStyle w:val="Lienhypertexte"/>
@@ -2345,7 +2345,7 @@
             <w:noProof/>
             <w:webHidden/>
           </w:rPr>
-          <w:instrText xml:space="preserve"> PAGEREF _Toc233659551 \h </w:instrText>
+          <w:instrText xml:space="preserve"> PAGEREF _Toc233660851 \h </w:instrText>
         </w:r>
         <w:r>
           <w:rPr>
@@ -2391,7 +2391,7 @@
           <w14:ligatures w14:val="standardContextual"/>
         </w:rPr>
       </w:pPr>
-      <w:hyperlink w:anchor="_Toc233659552" w:history="1">
+      <w:hyperlink w:anchor="_Toc233660852" w:history="1">
         <w:r>
           <w:rPr>
             <w:rStyle w:val="Lienhypertexte"/>
@@ -2437,7 +2437,7 @@
             <w:noProof/>
             <w:webHidden/>
           </w:rPr>
-          <w:instrText xml:space="preserve"> PAGEREF _Toc233659552 \h </w:instrText>
+          <w:instrText xml:space="preserve"> PAGEREF _Toc233660852 \h </w:instrText>
         </w:r>
         <w:r>
           <w:rPr>
@@ -2483,7 +2483,7 @@
           <w14:ligatures w14:val="standardContextual"/>
         </w:rPr>
       </w:pPr>
-      <w:hyperlink w:anchor="_Toc233659553" w:history="1">
+      <w:hyperlink w:anchor="_Toc233660853" w:history="1">
         <w:r>
           <w:rPr>
             <w:rStyle w:val="Lienhypertexte"/>
@@ -2508,7 +2508,7 @@
             <w:noProof/>
             <w:lang w:eastAsia="fr-FR"/>
           </w:rPr>
-          <w:t>D.1 État livré (MVP)</w:t>
+          <w:t>État livré (MVP)</w:t>
         </w:r>
         <w:r>
           <w:rPr>
@@ -2529,7 +2529,7 @@
             <w:noProof/>
             <w:webHidden/>
           </w:rPr>
-          <w:instrText xml:space="preserve"> PAGEREF _Toc233659553 \h </w:instrText>
+          <w:instrText xml:space="preserve"> PAGEREF _Toc233660853 \h </w:instrText>
         </w:r>
         <w:r>
           <w:rPr>
@@ -2575,7 +2575,7 @@
           <w14:ligatures w14:val="standardContextual"/>
         </w:rPr>
       </w:pPr>
-      <w:hyperlink w:anchor="_Toc233659554" w:history="1">
+      <w:hyperlink w:anchor="_Toc233660854" w:history="1">
         <w:r>
           <w:rPr>
             <w:rStyle w:val="Lienhypertexte"/>
@@ -2600,7 +2600,7 @@
             <w:noProof/>
             <w:lang w:eastAsia="fr-FR"/>
           </w:rPr>
-          <w:t>D.2 Backlog priorisé des évolutions</w:t>
+          <w:t>Backlog priorisé des évolutions</w:t>
         </w:r>
         <w:r>
           <w:rPr>
@@ -2621,7 +2621,7 @@
             <w:noProof/>
             <w:webHidden/>
           </w:rPr>
-          <w:instrText xml:space="preserve"> PAGEREF _Toc233659554 \h </w:instrText>
+          <w:instrText xml:space="preserve"> PAGEREF _Toc233660854 \h </w:instrText>
         </w:r>
         <w:r>
           <w:rPr>
@@ -2697,7 +2697,7 @@
         </w:rPr>
       </w:pPr>
       <w:bookmarkStart w:id="0" w:name="_Toc233658142"/>
-      <w:bookmarkStart w:id="1" w:name="_Toc233659535"/>
+      <w:bookmarkStart w:id="1" w:name="_Toc233660835"/>
       <w:r>
         <w:rPr>
           <w:lang w:eastAsia="fr-FR"/>
@@ -2783,12 +2783,6 @@
         <w:gridCol w:w="4060"/>
       </w:tblGrid>
       <w:tr>
-        <w:tblPrEx>
-          <w:tblCellMar>
-            <w:top w:w="0" w:type="dxa"/>
-            <w:bottom w:w="0" w:type="dxa"/>
-          </w:tblCellMar>
-        </w:tblPrEx>
         <w:trPr>
           <w:tblHeader/>
           <w:jc w:val="center"/>
@@ -2900,12 +2894,6 @@
         </w:tc>
       </w:tr>
       <w:tr>
-        <w:tblPrEx>
-          <w:tblCellMar>
-            <w:top w:w="0" w:type="dxa"/>
-            <w:bottom w:w="0" w:type="dxa"/>
-          </w:tblCellMar>
-        </w:tblPrEx>
         <w:trPr>
           <w:trHeight w:val="506"/>
           <w:jc w:val="center"/>
@@ -3011,12 +2999,6 @@
         </w:tc>
       </w:tr>
       <w:tr>
-        <w:tblPrEx>
-          <w:tblCellMar>
-            <w:top w:w="0" w:type="dxa"/>
-            <w:bottom w:w="0" w:type="dxa"/>
-          </w:tblCellMar>
-        </w:tblPrEx>
         <w:trPr>
           <w:trHeight w:val="506"/>
           <w:jc w:val="center"/>
@@ -3050,20 +3032,8 @@
                 <w:szCs w:val="22"/>
                 <w:lang w:eastAsia="fr-FR"/>
               </w:rPr>
-              <w:t xml:space="preserve">B — Équipe </w:t>
-            </w:r>
-            <w:proofErr w:type="spellStart"/>
-            <w:r>
-              <w:rPr>
-                <w:rFonts w:eastAsia="Arial" w:cs="Arial"/>
-                <w:color w:val="000000"/>
-                <w:sz w:val="22"/>
-                <w:szCs w:val="22"/>
-                <w:lang w:eastAsia="fr-FR"/>
-              </w:rPr>
-              <w:t>NeoTravel</w:t>
-            </w:r>
-            <w:proofErr w:type="spellEnd"/>
+              <w:t>B — Équipe NeoTravel</w:t>
+            </w:r>
           </w:p>
         </w:tc>
         <w:tc>
@@ -3134,12 +3104,6 @@
         </w:tc>
       </w:tr>
       <w:tr>
-        <w:tblPrEx>
-          <w:tblCellMar>
-            <w:top w:w="0" w:type="dxa"/>
-            <w:bottom w:w="0" w:type="dxa"/>
-          </w:tblCellMar>
-        </w:tblPrEx>
         <w:trPr>
           <w:trHeight w:val="506"/>
           <w:jc w:val="center"/>
@@ -3239,62 +3203,12 @@
                 <w:szCs w:val="22"/>
                 <w:lang w:eastAsia="fr-FR"/>
               </w:rPr>
-              <w:t xml:space="preserve">Où modifier </w:t>
-            </w:r>
-            <w:proofErr w:type="spellStart"/>
-            <w:r>
-              <w:rPr>
-                <w:rFonts w:eastAsia="Arial" w:cs="Arial"/>
-                <w:color w:val="000000"/>
-                <w:sz w:val="22"/>
-                <w:szCs w:val="22"/>
-                <w:lang w:eastAsia="fr-FR"/>
-              </w:rPr>
-              <w:t>pricing</w:t>
-            </w:r>
-            <w:proofErr w:type="spellEnd"/>
-            <w:r>
-              <w:rPr>
-                <w:rFonts w:eastAsia="Arial" w:cs="Arial"/>
-                <w:color w:val="000000"/>
-                <w:sz w:val="22"/>
-                <w:szCs w:val="22"/>
-                <w:lang w:eastAsia="fr-FR"/>
-              </w:rPr>
-              <w:t xml:space="preserve">, </w:t>
-            </w:r>
-            <w:proofErr w:type="gramStart"/>
-            <w:r>
-              <w:rPr>
-                <w:rFonts w:eastAsia="Arial" w:cs="Arial"/>
-                <w:color w:val="000000"/>
-                <w:sz w:val="22"/>
-                <w:szCs w:val="22"/>
-                <w:lang w:eastAsia="fr-FR"/>
-              </w:rPr>
-              <w:t>emails</w:t>
-            </w:r>
-            <w:proofErr w:type="gramEnd"/>
-            <w:r>
-              <w:rPr>
-                <w:rFonts w:eastAsia="Arial" w:cs="Arial"/>
-                <w:color w:val="000000"/>
-                <w:sz w:val="22"/>
-                <w:szCs w:val="22"/>
-                <w:lang w:eastAsia="fr-FR"/>
-              </w:rPr>
-              <w:t>, statuts, relances</w:t>
+              <w:t>Où modifier pricing, emails, statuts, relances</w:t>
             </w:r>
           </w:p>
         </w:tc>
       </w:tr>
       <w:tr>
-        <w:tblPrEx>
-          <w:tblCellMar>
-            <w:top w:w="0" w:type="dxa"/>
-            <w:bottom w:w="0" w:type="dxa"/>
-          </w:tblCellMar>
-        </w:tblPrEx>
         <w:trPr>
           <w:trHeight w:val="506"/>
           <w:jc w:val="center"/>
@@ -3386,7 +3300,6 @@
                 <w:lang w:eastAsia="fr-FR"/>
               </w:rPr>
             </w:pPr>
-            <w:proofErr w:type="spellStart"/>
             <w:r>
               <w:rPr>
                 <w:rFonts w:eastAsia="Arial" w:cs="Arial"/>
@@ -3395,18 +3308,7 @@
                 <w:szCs w:val="22"/>
                 <w:lang w:eastAsia="fr-FR"/>
               </w:rPr>
-              <w:t>Backlog</w:t>
-            </w:r>
-            <w:proofErr w:type="spellEnd"/>
-            <w:r>
-              <w:rPr>
-                <w:rFonts w:eastAsia="Arial" w:cs="Arial"/>
-                <w:color w:val="000000"/>
-                <w:sz w:val="22"/>
-                <w:szCs w:val="22"/>
-                <w:lang w:eastAsia="fr-FR"/>
-              </w:rPr>
-              <w:t xml:space="preserve"> P1/P2/P3 et prochaines évolutions</w:t>
+              <w:t>Backlog P1/P2/P3 et prochaines évolutions</w:t>
             </w:r>
           </w:p>
         </w:tc>
@@ -3431,7 +3333,7 @@
       <w:pPr>
         <w:pStyle w:val="Titre1final"/>
       </w:pPr>
-      <w:bookmarkStart w:id="3" w:name="_Toc233659536"/>
+      <w:bookmarkStart w:id="3" w:name="_Toc233660836"/>
       <w:bookmarkEnd w:id="2"/>
       <w:r>
         <w:t>Partie A — Procédure « repreneur » (technique)</w:t>
@@ -3446,7 +3348,7 @@
         </w:rPr>
       </w:pPr>
       <w:bookmarkStart w:id="4" w:name="_Toc233658144"/>
-      <w:bookmarkStart w:id="5" w:name="_Toc233659537"/>
+      <w:bookmarkStart w:id="5" w:name="_Toc233660837"/>
       <w:r>
         <w:rPr>
           <w:lang w:eastAsia="fr-FR"/>
@@ -3467,91 +3369,7 @@
         <w:rPr>
           <w:lang w:eastAsia="fr-FR"/>
         </w:rPr>
-        <w:t xml:space="preserve">Application qui automatise le cycle commercial d’un intermédiaire en transport de groupe : un </w:t>
-      </w:r>
-      <w:proofErr w:type="spellStart"/>
-      <w:r>
-        <w:rPr>
-          <w:lang w:eastAsia="fr-FR"/>
-        </w:rPr>
-        <w:t>chatbot</w:t>
-      </w:r>
-      <w:proofErr w:type="spellEnd"/>
-      <w:r>
-        <w:rPr>
-          <w:lang w:eastAsia="fr-FR"/>
-        </w:rPr>
-        <w:t xml:space="preserve"> qualifie le besoin → un devis chiffré automatiquement (règles fixes, jamais l’IA) → </w:t>
-      </w:r>
-      <w:proofErr w:type="gramStart"/>
-      <w:r>
-        <w:rPr>
-          <w:lang w:eastAsia="fr-FR"/>
-        </w:rPr>
-        <w:t>email</w:t>
-      </w:r>
-      <w:proofErr w:type="gramEnd"/>
-      <w:r>
-        <w:rPr>
-          <w:lang w:eastAsia="fr-FR"/>
-        </w:rPr>
-        <w:t xml:space="preserve"> + PDF → relances auto → </w:t>
-      </w:r>
-      <w:proofErr w:type="spellStart"/>
-      <w:r>
-        <w:rPr>
-          <w:lang w:eastAsia="fr-FR"/>
-        </w:rPr>
-        <w:t>dashboard</w:t>
-      </w:r>
-      <w:proofErr w:type="spellEnd"/>
-      <w:r>
-        <w:rPr>
-          <w:lang w:eastAsia="fr-FR"/>
-        </w:rPr>
-        <w:t>. Stack : Next.js (</w:t>
-      </w:r>
-      <w:proofErr w:type="spellStart"/>
-      <w:r>
-        <w:rPr>
-          <w:lang w:eastAsia="fr-FR"/>
-        </w:rPr>
-        <w:t>Netlify</w:t>
-      </w:r>
-      <w:proofErr w:type="spellEnd"/>
-      <w:r>
-        <w:rPr>
-          <w:lang w:eastAsia="fr-FR"/>
-        </w:rPr>
-        <w:t xml:space="preserve">) + </w:t>
-      </w:r>
-      <w:proofErr w:type="spellStart"/>
-      <w:r>
-        <w:rPr>
-          <w:lang w:eastAsia="fr-FR"/>
-        </w:rPr>
-        <w:t>Supabase</w:t>
-      </w:r>
-      <w:proofErr w:type="spellEnd"/>
-      <w:r>
-        <w:rPr>
-          <w:lang w:eastAsia="fr-FR"/>
-        </w:rPr>
-        <w:t xml:space="preserve"> + n8n/Gemma + </w:t>
-      </w:r>
-      <w:proofErr w:type="spellStart"/>
-      <w:r>
-        <w:rPr>
-          <w:lang w:eastAsia="fr-FR"/>
-        </w:rPr>
-        <w:t>Resend</w:t>
-      </w:r>
-      <w:proofErr w:type="spellEnd"/>
-      <w:r>
-        <w:rPr>
-          <w:lang w:eastAsia="fr-FR"/>
-        </w:rPr>
-        <w:t>.</w:t>
+        <w:t>Application qui automatise le cycle commercial d’un intermédiaire en transport de groupe : un chatbot qualifie le besoin → un devis chiffré automatiquement (règles fixes, jamais l’IA) → email + PDF → relances auto → dashboard. Stack : Next.js (Netlify) + Supabase + n8n/Gemma + Resend.</w:t>
       </w:r>
     </w:p>
     <w:p>
@@ -3565,15 +3383,8 @@
         <w:rPr>
           <w:lang w:eastAsia="fr-FR"/>
         </w:rPr>
-        <w:t>L</w:t>
-      </w:r>
-      <w:r>
-        <w:rPr>
-          <w:lang w:eastAsia="fr-FR"/>
-        </w:rPr>
-        <w:t>’IA comprend et oriente, mais le prix vient toujours du code déterministe (</w:t>
-      </w:r>
-      <w:proofErr w:type="spellStart"/>
+        <w:t>L’IA comprend et oriente, mais le prix vient toujours du code déterministe (</w:t>
+      </w:r>
       <w:r>
         <w:rPr>
           <w:rFonts w:ascii="Consolas" w:eastAsia="Consolas" w:hAnsi="Consolas" w:cs="Consolas"/>
@@ -3583,7 +3394,6 @@
         </w:rPr>
         <w:t>calculerDevis</w:t>
       </w:r>
-      <w:proofErr w:type="spellEnd"/>
       <w:r>
         <w:rPr>
           <w:lang w:eastAsia="fr-FR"/>
@@ -3599,7 +3409,7 @@
         </w:rPr>
       </w:pPr>
       <w:bookmarkStart w:id="6" w:name="_Toc233658145"/>
-      <w:bookmarkStart w:id="7" w:name="_Toc233659538"/>
+      <w:bookmarkStart w:id="7" w:name="_Toc233660838"/>
       <w:r>
         <w:rPr>
           <w:lang w:eastAsia="fr-FR"/>
@@ -3663,12 +3473,6 @@
         <w:gridCol w:w="5160"/>
       </w:tblGrid>
       <w:tr>
-        <w:tblPrEx>
-          <w:tblCellMar>
-            <w:top w:w="0" w:type="dxa"/>
-            <w:bottom w:w="0" w:type="dxa"/>
-          </w:tblCellMar>
-        </w:tblPrEx>
         <w:trPr>
           <w:tblHeader/>
           <w:jc w:val="center"/>
@@ -3745,12 +3549,6 @@
         </w:tc>
       </w:tr>
       <w:tr>
-        <w:tblPrEx>
-          <w:tblCellMar>
-            <w:top w:w="0" w:type="dxa"/>
-            <w:bottom w:w="0" w:type="dxa"/>
-          </w:tblCellMar>
-        </w:tblPrEx>
         <w:trPr>
           <w:trHeight w:val="506"/>
           <w:jc w:val="center"/>
@@ -3823,12 +3621,6 @@
         </w:tc>
       </w:tr>
       <w:tr>
-        <w:tblPrEx>
-          <w:tblCellMar>
-            <w:top w:w="0" w:type="dxa"/>
-            <w:bottom w:w="0" w:type="dxa"/>
-          </w:tblCellMar>
-        </w:tblPrEx>
         <w:trPr>
           <w:trHeight w:val="506"/>
           <w:jc w:val="center"/>
@@ -3901,12 +3693,6 @@
         </w:tc>
       </w:tr>
       <w:tr>
-        <w:tblPrEx>
-          <w:tblCellMar>
-            <w:top w:w="0" w:type="dxa"/>
-            <w:bottom w:w="0" w:type="dxa"/>
-          </w:tblCellMar>
-        </w:tblPrEx>
         <w:trPr>
           <w:trHeight w:val="506"/>
           <w:jc w:val="center"/>
@@ -3979,12 +3765,6 @@
         </w:tc>
       </w:tr>
       <w:tr>
-        <w:tblPrEx>
-          <w:tblCellMar>
-            <w:top w:w="0" w:type="dxa"/>
-            <w:bottom w:w="0" w:type="dxa"/>
-          </w:tblCellMar>
-        </w:tblPrEx>
         <w:trPr>
           <w:trHeight w:val="506"/>
           <w:jc w:val="center"/>
@@ -4043,7 +3823,6 @@
                 <w:lang w:eastAsia="fr-FR"/>
               </w:rPr>
             </w:pPr>
-            <w:proofErr w:type="gramStart"/>
             <w:r>
               <w:rPr>
                 <w:rFonts w:eastAsia="Arial" w:cs="Arial"/>
@@ -4052,73 +3831,12 @@
                 <w:szCs w:val="22"/>
                 <w:lang w:eastAsia="fr-FR"/>
               </w:rPr>
-              <w:t>lancer</w:t>
-            </w:r>
-            <w:proofErr w:type="gramEnd"/>
-            <w:r>
-              <w:rPr>
-                <w:rFonts w:eastAsia="Arial" w:cs="Arial"/>
-                <w:color w:val="000000"/>
-                <w:sz w:val="22"/>
-                <w:szCs w:val="22"/>
-                <w:lang w:eastAsia="fr-FR"/>
-              </w:rPr>
-              <w:t xml:space="preserve"> le front → /docs (Swagger) ; ou </w:t>
-            </w:r>
-            <w:proofErr w:type="spellStart"/>
-            <w:r>
-              <w:rPr>
-                <w:rFonts w:eastAsia="Arial" w:cs="Arial"/>
-                <w:color w:val="000000"/>
-                <w:sz w:val="22"/>
-                <w:szCs w:val="22"/>
-                <w:lang w:eastAsia="fr-FR"/>
-              </w:rPr>
-              <w:t>npm</w:t>
-            </w:r>
-            <w:proofErr w:type="spellEnd"/>
-            <w:r>
-              <w:rPr>
-                <w:rFonts w:eastAsia="Arial" w:cs="Arial"/>
-                <w:color w:val="000000"/>
-                <w:sz w:val="22"/>
-                <w:szCs w:val="22"/>
-                <w:lang w:eastAsia="fr-FR"/>
-              </w:rPr>
-              <w:t xml:space="preserve"> run doc (</w:t>
-            </w:r>
-            <w:proofErr w:type="spellStart"/>
-            <w:r>
-              <w:rPr>
-                <w:rFonts w:eastAsia="Arial" w:cs="Arial"/>
-                <w:color w:val="000000"/>
-                <w:sz w:val="22"/>
-                <w:szCs w:val="22"/>
-                <w:lang w:eastAsia="fr-FR"/>
-              </w:rPr>
-              <w:t>TypeDoc</w:t>
-            </w:r>
-            <w:proofErr w:type="spellEnd"/>
-            <w:r>
-              <w:rPr>
-                <w:rFonts w:eastAsia="Arial" w:cs="Arial"/>
-                <w:color w:val="000000"/>
-                <w:sz w:val="22"/>
-                <w:szCs w:val="22"/>
-                <w:lang w:eastAsia="fr-FR"/>
-              </w:rPr>
-              <w:t>)</w:t>
+              <w:t>lancer le front → /docs (Swagger) ; ou npm run doc (TypeDoc)</w:t>
             </w:r>
           </w:p>
         </w:tc>
       </w:tr>
       <w:tr>
-        <w:tblPrEx>
-          <w:tblCellMar>
-            <w:top w:w="0" w:type="dxa"/>
-            <w:bottom w:w="0" w:type="dxa"/>
-          </w:tblCellMar>
-        </w:tblPrEx>
         <w:trPr>
           <w:trHeight w:val="506"/>
           <w:jc w:val="center"/>
@@ -4191,12 +3909,6 @@
         </w:tc>
       </w:tr>
       <w:tr>
-        <w:tblPrEx>
-          <w:tblCellMar>
-            <w:top w:w="0" w:type="dxa"/>
-            <w:bottom w:w="0" w:type="dxa"/>
-          </w:tblCellMar>
-        </w:tblPrEx>
         <w:trPr>
           <w:trHeight w:val="506"/>
           <w:jc w:val="center"/>
@@ -4269,12 +3981,6 @@
         </w:tc>
       </w:tr>
       <w:tr>
-        <w:tblPrEx>
-          <w:tblCellMar>
-            <w:top w:w="0" w:type="dxa"/>
-            <w:bottom w:w="0" w:type="dxa"/>
-          </w:tblCellMar>
-        </w:tblPrEx>
         <w:trPr>
           <w:trHeight w:val="506"/>
           <w:jc w:val="center"/>
@@ -4348,12 +4054,6 @@
         </w:tc>
       </w:tr>
       <w:tr>
-        <w:tblPrEx>
-          <w:tblCellMar>
-            <w:top w:w="0" w:type="dxa"/>
-            <w:bottom w:w="0" w:type="dxa"/>
-          </w:tblCellMar>
-        </w:tblPrEx>
         <w:trPr>
           <w:trHeight w:val="506"/>
           <w:jc w:val="center"/>
@@ -4434,7 +4134,7 @@
         </w:rPr>
       </w:pPr>
       <w:bookmarkStart w:id="8" w:name="_Toc233658146"/>
-      <w:bookmarkStart w:id="9" w:name="_Toc233659539"/>
+      <w:bookmarkStart w:id="9" w:name="_Toc233660839"/>
       <w:r>
         <w:rPr>
           <w:lang w:eastAsia="fr-FR"/>
@@ -4476,8 +4176,6 @@
           <w:lang w:eastAsia="fr-FR"/>
         </w:rPr>
       </w:pPr>
-      <w:proofErr w:type="spellStart"/>
-      <w:proofErr w:type="gramStart"/>
       <w:r>
         <w:rPr>
           <w:rFonts w:ascii="Consolas" w:eastAsia="Consolas" w:hAnsi="Consolas" w:cs="Consolas"/>
@@ -4485,10 +4183,20 @@
           <w:szCs w:val="18"/>
           <w:lang w:eastAsia="fr-FR"/>
         </w:rPr>
-        <w:t>npm</w:t>
-      </w:r>
-      <w:proofErr w:type="spellEnd"/>
-      <w:proofErr w:type="gramEnd"/>
+        <w:t>npm install &amp;&amp; npm test</w:t>
+      </w:r>
+    </w:p>
+    <w:p>
+      <w:pPr>
+        <w:shd w:val="clear" w:color="auto" w:fill="F4F4F4"/>
+        <w:spacing w:after="0" w:line="240" w:lineRule="auto"/>
+        <w:rPr>
+          <w:rFonts w:ascii="Arial" w:eastAsia="Arial" w:hAnsi="Arial" w:cs="Arial"/>
+          <w:sz w:val="22"/>
+          <w:szCs w:val="22"/>
+          <w:lang w:eastAsia="fr-FR"/>
+        </w:rPr>
+      </w:pPr>
       <w:r>
         <w:rPr>
           <w:rFonts w:ascii="Consolas" w:eastAsia="Consolas" w:hAnsi="Consolas" w:cs="Consolas"/>
@@ -4496,9 +4204,20 @@
           <w:szCs w:val="18"/>
           <w:lang w:eastAsia="fr-FR"/>
         </w:rPr>
-        <w:t xml:space="preserve"> </w:t>
-      </w:r>
-      <w:proofErr w:type="spellStart"/>
+        <w:t># 2. Base : exécuter supabase/reset-complet.sql dans Supabase (SQL Editor)</w:t>
+      </w:r>
+    </w:p>
+    <w:p>
+      <w:pPr>
+        <w:shd w:val="clear" w:color="auto" w:fill="F4F4F4"/>
+        <w:spacing w:after="0" w:line="240" w:lineRule="auto"/>
+        <w:rPr>
+          <w:rFonts w:ascii="Arial" w:eastAsia="Arial" w:hAnsi="Arial" w:cs="Arial"/>
+          <w:sz w:val="22"/>
+          <w:szCs w:val="22"/>
+          <w:lang w:eastAsia="fr-FR"/>
+        </w:rPr>
+      </w:pPr>
       <w:r>
         <w:rPr>
           <w:rFonts w:ascii="Consolas" w:eastAsia="Consolas" w:hAnsi="Consolas" w:cs="Consolas"/>
@@ -4506,9 +4225,20 @@
           <w:szCs w:val="18"/>
           <w:lang w:eastAsia="fr-FR"/>
         </w:rPr>
-        <w:t>install</w:t>
-      </w:r>
-      <w:proofErr w:type="spellEnd"/>
+        <w:t># 3. Front</w:t>
+      </w:r>
+    </w:p>
+    <w:p>
+      <w:pPr>
+        <w:shd w:val="clear" w:color="auto" w:fill="F4F4F4"/>
+        <w:spacing w:after="0" w:line="240" w:lineRule="auto"/>
+        <w:rPr>
+          <w:rFonts w:ascii="Arial" w:eastAsia="Arial" w:hAnsi="Arial" w:cs="Arial"/>
+          <w:sz w:val="22"/>
+          <w:szCs w:val="22"/>
+          <w:lang w:eastAsia="fr-FR"/>
+        </w:rPr>
+      </w:pPr>
       <w:r>
         <w:rPr>
           <w:rFonts w:ascii="Consolas" w:eastAsia="Consolas" w:hAnsi="Consolas" w:cs="Consolas"/>
@@ -4516,9 +4246,20 @@
           <w:szCs w:val="18"/>
           <w:lang w:eastAsia="fr-FR"/>
         </w:rPr>
-        <w:t xml:space="preserve"> &amp;&amp; </w:t>
-      </w:r>
-      <w:proofErr w:type="spellStart"/>
+        <w:t>cd web &amp;&amp; cp .env.local.example .env.local   # remplir les clés</w:t>
+      </w:r>
+    </w:p>
+    <w:p>
+      <w:pPr>
+        <w:shd w:val="clear" w:color="auto" w:fill="F4F4F4"/>
+        <w:spacing w:after="0" w:line="240" w:lineRule="auto"/>
+        <w:rPr>
+          <w:rFonts w:ascii="Arial" w:eastAsia="Arial" w:hAnsi="Arial" w:cs="Arial"/>
+          <w:sz w:val="22"/>
+          <w:szCs w:val="22"/>
+          <w:lang w:eastAsia="fr-FR"/>
+        </w:rPr>
+      </w:pPr>
       <w:r>
         <w:rPr>
           <w:rFonts w:ascii="Consolas" w:eastAsia="Consolas" w:hAnsi="Consolas" w:cs="Consolas"/>
@@ -4526,9 +4267,20 @@
           <w:szCs w:val="18"/>
           <w:lang w:eastAsia="fr-FR"/>
         </w:rPr>
-        <w:t>npm</w:t>
-      </w:r>
-      <w:proofErr w:type="spellEnd"/>
+        <w:t>npm install &amp;&amp; npm run dev                   # http://localhost:3000</w:t>
+      </w:r>
+    </w:p>
+    <w:p>
+      <w:pPr>
+        <w:shd w:val="clear" w:color="auto" w:fill="F4F4F4"/>
+        <w:spacing w:after="140" w:line="240" w:lineRule="auto"/>
+        <w:rPr>
+          <w:rFonts w:ascii="Arial" w:eastAsia="Arial" w:hAnsi="Arial" w:cs="Arial"/>
+          <w:sz w:val="22"/>
+          <w:szCs w:val="22"/>
+          <w:lang w:eastAsia="fr-FR"/>
+        </w:rPr>
+      </w:pPr>
       <w:r>
         <w:rPr>
           <w:rFonts w:ascii="Consolas" w:eastAsia="Consolas" w:hAnsi="Consolas" w:cs="Consolas"/>
@@ -4536,13 +4288,12 @@
           <w:szCs w:val="18"/>
           <w:lang w:eastAsia="fr-FR"/>
         </w:rPr>
-        <w:t xml:space="preserve"> test</w:t>
-      </w:r>
-    </w:p>
-    <w:p>
-      <w:pPr>
-        <w:shd w:val="clear" w:color="auto" w:fill="F4F4F4"/>
-        <w:spacing w:after="0" w:line="240" w:lineRule="auto"/>
+        <w:t># 4. Agent : importer n8n/agent-workflow.json (+ credential Gemini)</w:t>
+      </w:r>
+    </w:p>
+    <w:p>
+      <w:pPr>
+        <w:spacing w:after="120" w:line="240" w:lineRule="auto"/>
         <w:rPr>
           <w:rFonts w:ascii="Arial" w:eastAsia="Arial" w:hAnsi="Arial" w:cs="Arial"/>
           <w:sz w:val="22"/>
@@ -4552,14 +4303,49 @@
       </w:pPr>
       <w:r>
         <w:rPr>
+          <w:rFonts w:ascii="Arial" w:eastAsia="Arial" w:hAnsi="Arial" w:cs="Arial"/>
+          <w:sz w:val="22"/>
+          <w:szCs w:val="22"/>
+          <w:lang w:eastAsia="fr-FR"/>
+        </w:rPr>
+        <w:t>Vérif</w:t>
+      </w:r>
+      <w:r>
+        <w:rPr>
+          <w:rFonts w:ascii="Arial" w:eastAsia="Arial" w:hAnsi="Arial" w:cs="Arial"/>
+          <w:sz w:val="22"/>
+          <w:szCs w:val="22"/>
+          <w:lang w:eastAsia="fr-FR"/>
+        </w:rPr>
+        <w:t>ication</w:t>
+      </w:r>
+      <w:r>
+        <w:rPr>
+          <w:rFonts w:ascii="Arial" w:eastAsia="Arial" w:hAnsi="Arial" w:cs="Arial"/>
+          <w:sz w:val="22"/>
+          <w:szCs w:val="22"/>
+          <w:lang w:eastAsia="fr-FR"/>
+        </w:rPr>
+        <w:t xml:space="preserve"> : </w:t>
+      </w:r>
+      <w:r>
+        <w:rPr>
           <w:rFonts w:ascii="Consolas" w:eastAsia="Consolas" w:hAnsi="Consolas" w:cs="Consolas"/>
           <w:sz w:val="18"/>
           <w:szCs w:val="18"/>
           <w:lang w:eastAsia="fr-FR"/>
         </w:rPr>
-        <w:t xml:space="preserve"># 2. Base : exécuter </w:t>
-      </w:r>
-      <w:proofErr w:type="spellStart"/>
+        <w:t>cd web &amp;&amp; npm run lint</w:t>
+      </w:r>
+      <w:r>
+        <w:rPr>
+          <w:rFonts w:ascii="Arial" w:eastAsia="Arial" w:hAnsi="Arial" w:cs="Arial"/>
+          <w:sz w:val="22"/>
+          <w:szCs w:val="22"/>
+          <w:lang w:eastAsia="fr-FR"/>
+        </w:rPr>
+        <w:t xml:space="preserve"> (0) · </w:t>
+      </w:r>
       <w:r>
         <w:rPr>
           <w:rFonts w:ascii="Consolas" w:eastAsia="Consolas" w:hAnsi="Consolas" w:cs="Consolas"/>
@@ -4567,9 +4353,17 @@
           <w:szCs w:val="18"/>
           <w:lang w:eastAsia="fr-FR"/>
         </w:rPr>
-        <w:t>supabase</w:t>
-      </w:r>
-      <w:proofErr w:type="spellEnd"/>
+        <w:t>npx vitest run</w:t>
+      </w:r>
+      <w:r>
+        <w:rPr>
+          <w:rFonts w:ascii="Arial" w:eastAsia="Arial" w:hAnsi="Arial" w:cs="Arial"/>
+          <w:sz w:val="22"/>
+          <w:szCs w:val="22"/>
+          <w:lang w:eastAsia="fr-FR"/>
+        </w:rPr>
+        <w:t xml:space="preserve"> · </w:t>
+      </w:r>
       <w:r>
         <w:rPr>
           <w:rFonts w:ascii="Consolas" w:eastAsia="Consolas" w:hAnsi="Consolas" w:cs="Consolas"/>
@@ -4577,501 +4371,15 @@
           <w:szCs w:val="18"/>
           <w:lang w:eastAsia="fr-FR"/>
         </w:rPr>
-        <w:t>/reset-</w:t>
-      </w:r>
-      <w:proofErr w:type="spellStart"/>
-      <w:r>
-        <w:rPr>
-          <w:rFonts w:ascii="Consolas" w:eastAsia="Consolas" w:hAnsi="Consolas" w:cs="Consolas"/>
-          <w:sz w:val="18"/>
-          <w:szCs w:val="18"/>
-          <w:lang w:eastAsia="fr-FR"/>
-        </w:rPr>
-        <w:t>complet.sql</w:t>
-      </w:r>
-      <w:proofErr w:type="spellEnd"/>
-      <w:r>
-        <w:rPr>
-          <w:rFonts w:ascii="Consolas" w:eastAsia="Consolas" w:hAnsi="Consolas" w:cs="Consolas"/>
-          <w:sz w:val="18"/>
-          <w:szCs w:val="18"/>
-          <w:lang w:eastAsia="fr-FR"/>
-        </w:rPr>
-        <w:t xml:space="preserve"> dans </w:t>
-      </w:r>
-      <w:proofErr w:type="spellStart"/>
-      <w:r>
-        <w:rPr>
-          <w:rFonts w:ascii="Consolas" w:eastAsia="Consolas" w:hAnsi="Consolas" w:cs="Consolas"/>
-          <w:sz w:val="18"/>
-          <w:szCs w:val="18"/>
-          <w:lang w:eastAsia="fr-FR"/>
-        </w:rPr>
-        <w:t>Supabase</w:t>
-      </w:r>
-      <w:proofErr w:type="spellEnd"/>
-      <w:r>
-        <w:rPr>
-          <w:rFonts w:ascii="Consolas" w:eastAsia="Consolas" w:hAnsi="Consolas" w:cs="Consolas"/>
-          <w:sz w:val="18"/>
-          <w:szCs w:val="18"/>
-          <w:lang w:eastAsia="fr-FR"/>
-        </w:rPr>
-        <w:t xml:space="preserve"> (SQL Editor)</w:t>
-      </w:r>
-    </w:p>
-    <w:p>
-      <w:pPr>
-        <w:shd w:val="clear" w:color="auto" w:fill="F4F4F4"/>
-        <w:spacing w:after="0" w:line="240" w:lineRule="auto"/>
+        <w:t>npm run build</w:t>
+      </w:r>
+      <w:r>
         <w:rPr>
           <w:rFonts w:ascii="Arial" w:eastAsia="Arial" w:hAnsi="Arial" w:cs="Arial"/>
           <w:sz w:val="22"/>
           <w:szCs w:val="22"/>
           <w:lang w:eastAsia="fr-FR"/>
         </w:rPr>
-      </w:pPr>
-      <w:r>
-        <w:rPr>
-          <w:rFonts w:ascii="Consolas" w:eastAsia="Consolas" w:hAnsi="Consolas" w:cs="Consolas"/>
-          <w:sz w:val="18"/>
-          <w:szCs w:val="18"/>
-          <w:lang w:eastAsia="fr-FR"/>
-        </w:rPr>
-        <w:t># 3. Front</w:t>
-      </w:r>
-    </w:p>
-    <w:p>
-      <w:pPr>
-        <w:shd w:val="clear" w:color="auto" w:fill="F4F4F4"/>
-        <w:spacing w:after="0" w:line="240" w:lineRule="auto"/>
-        <w:rPr>
-          <w:rFonts w:ascii="Arial" w:eastAsia="Arial" w:hAnsi="Arial" w:cs="Arial"/>
-          <w:sz w:val="22"/>
-          <w:szCs w:val="22"/>
-          <w:lang w:eastAsia="fr-FR"/>
-        </w:rPr>
-      </w:pPr>
-      <w:proofErr w:type="gramStart"/>
-      <w:r>
-        <w:rPr>
-          <w:rFonts w:ascii="Consolas" w:eastAsia="Consolas" w:hAnsi="Consolas" w:cs="Consolas"/>
-          <w:sz w:val="18"/>
-          <w:szCs w:val="18"/>
-          <w:lang w:eastAsia="fr-FR"/>
-        </w:rPr>
-        <w:t>cd</w:t>
-      </w:r>
-      <w:proofErr w:type="gramEnd"/>
-      <w:r>
-        <w:rPr>
-          <w:rFonts w:ascii="Consolas" w:eastAsia="Consolas" w:hAnsi="Consolas" w:cs="Consolas"/>
-          <w:sz w:val="18"/>
-          <w:szCs w:val="18"/>
-          <w:lang w:eastAsia="fr-FR"/>
-        </w:rPr>
-        <w:t xml:space="preserve"> web &amp;&amp; </w:t>
-      </w:r>
-      <w:proofErr w:type="spellStart"/>
-      <w:proofErr w:type="gramStart"/>
-      <w:r>
-        <w:rPr>
-          <w:rFonts w:ascii="Consolas" w:eastAsia="Consolas" w:hAnsi="Consolas" w:cs="Consolas"/>
-          <w:sz w:val="18"/>
-          <w:szCs w:val="18"/>
-          <w:lang w:eastAsia="fr-FR"/>
-        </w:rPr>
-        <w:t>cp</w:t>
-      </w:r>
-      <w:proofErr w:type="spellEnd"/>
-      <w:r>
-        <w:rPr>
-          <w:rFonts w:ascii="Consolas" w:eastAsia="Consolas" w:hAnsi="Consolas" w:cs="Consolas"/>
-          <w:sz w:val="18"/>
-          <w:szCs w:val="18"/>
-          <w:lang w:eastAsia="fr-FR"/>
-        </w:rPr>
-        <w:t xml:space="preserve"> .</w:t>
-      </w:r>
-      <w:proofErr w:type="spellStart"/>
-      <w:r>
-        <w:rPr>
-          <w:rFonts w:ascii="Consolas" w:eastAsia="Consolas" w:hAnsi="Consolas" w:cs="Consolas"/>
-          <w:sz w:val="18"/>
-          <w:szCs w:val="18"/>
-          <w:lang w:eastAsia="fr-FR"/>
-        </w:rPr>
-        <w:t>env</w:t>
-      </w:r>
-      <w:proofErr w:type="gramEnd"/>
-      <w:r>
-        <w:rPr>
-          <w:rFonts w:ascii="Consolas" w:eastAsia="Consolas" w:hAnsi="Consolas" w:cs="Consolas"/>
-          <w:sz w:val="18"/>
-          <w:szCs w:val="18"/>
-          <w:lang w:eastAsia="fr-FR"/>
-        </w:rPr>
-        <w:t>.local.</w:t>
-      </w:r>
-      <w:proofErr w:type="gramStart"/>
-      <w:r>
-        <w:rPr>
-          <w:rFonts w:ascii="Consolas" w:eastAsia="Consolas" w:hAnsi="Consolas" w:cs="Consolas"/>
-          <w:sz w:val="18"/>
-          <w:szCs w:val="18"/>
-          <w:lang w:eastAsia="fr-FR"/>
-        </w:rPr>
-        <w:t>example</w:t>
-      </w:r>
-      <w:proofErr w:type="spellEnd"/>
-      <w:r>
-        <w:rPr>
-          <w:rFonts w:ascii="Consolas" w:eastAsia="Consolas" w:hAnsi="Consolas" w:cs="Consolas"/>
-          <w:sz w:val="18"/>
-          <w:szCs w:val="18"/>
-          <w:lang w:eastAsia="fr-FR"/>
-        </w:rPr>
-        <w:t xml:space="preserve"> .</w:t>
-      </w:r>
-      <w:proofErr w:type="spellStart"/>
-      <w:r>
-        <w:rPr>
-          <w:rFonts w:ascii="Consolas" w:eastAsia="Consolas" w:hAnsi="Consolas" w:cs="Consolas"/>
-          <w:sz w:val="18"/>
-          <w:szCs w:val="18"/>
-          <w:lang w:eastAsia="fr-FR"/>
-        </w:rPr>
-        <w:t>env</w:t>
-      </w:r>
-      <w:proofErr w:type="gramEnd"/>
-      <w:r>
-        <w:rPr>
-          <w:rFonts w:ascii="Consolas" w:eastAsia="Consolas" w:hAnsi="Consolas" w:cs="Consolas"/>
-          <w:sz w:val="18"/>
-          <w:szCs w:val="18"/>
-          <w:lang w:eastAsia="fr-FR"/>
-        </w:rPr>
-        <w:t>.local</w:t>
-      </w:r>
-      <w:proofErr w:type="spellEnd"/>
-      <w:r>
-        <w:rPr>
-          <w:rFonts w:ascii="Consolas" w:eastAsia="Consolas" w:hAnsi="Consolas" w:cs="Consolas"/>
-          <w:sz w:val="18"/>
-          <w:szCs w:val="18"/>
-          <w:lang w:eastAsia="fr-FR"/>
-        </w:rPr>
-        <w:t xml:space="preserve">   # remplir les clés</w:t>
-      </w:r>
-    </w:p>
-    <w:p>
-      <w:pPr>
-        <w:shd w:val="clear" w:color="auto" w:fill="F4F4F4"/>
-        <w:spacing w:after="0" w:line="240" w:lineRule="auto"/>
-        <w:rPr>
-          <w:rFonts w:ascii="Arial" w:eastAsia="Arial" w:hAnsi="Arial" w:cs="Arial"/>
-          <w:sz w:val="22"/>
-          <w:szCs w:val="22"/>
-          <w:lang w:eastAsia="fr-FR"/>
-        </w:rPr>
-      </w:pPr>
-      <w:proofErr w:type="spellStart"/>
-      <w:proofErr w:type="gramStart"/>
-      <w:r>
-        <w:rPr>
-          <w:rFonts w:ascii="Consolas" w:eastAsia="Consolas" w:hAnsi="Consolas" w:cs="Consolas"/>
-          <w:sz w:val="18"/>
-          <w:szCs w:val="18"/>
-          <w:lang w:eastAsia="fr-FR"/>
-        </w:rPr>
-        <w:t>npm</w:t>
-      </w:r>
-      <w:proofErr w:type="spellEnd"/>
-      <w:proofErr w:type="gramEnd"/>
-      <w:r>
-        <w:rPr>
-          <w:rFonts w:ascii="Consolas" w:eastAsia="Consolas" w:hAnsi="Consolas" w:cs="Consolas"/>
-          <w:sz w:val="18"/>
-          <w:szCs w:val="18"/>
-          <w:lang w:eastAsia="fr-FR"/>
-        </w:rPr>
-        <w:t xml:space="preserve"> </w:t>
-      </w:r>
-      <w:proofErr w:type="spellStart"/>
-      <w:r>
-        <w:rPr>
-          <w:rFonts w:ascii="Consolas" w:eastAsia="Consolas" w:hAnsi="Consolas" w:cs="Consolas"/>
-          <w:sz w:val="18"/>
-          <w:szCs w:val="18"/>
-          <w:lang w:eastAsia="fr-FR"/>
-        </w:rPr>
-        <w:t>install</w:t>
-      </w:r>
-      <w:proofErr w:type="spellEnd"/>
-      <w:r>
-        <w:rPr>
-          <w:rFonts w:ascii="Consolas" w:eastAsia="Consolas" w:hAnsi="Consolas" w:cs="Consolas"/>
-          <w:sz w:val="18"/>
-          <w:szCs w:val="18"/>
-          <w:lang w:eastAsia="fr-FR"/>
-        </w:rPr>
-        <w:t xml:space="preserve"> &amp;&amp; </w:t>
-      </w:r>
-      <w:proofErr w:type="spellStart"/>
-      <w:r>
-        <w:rPr>
-          <w:rFonts w:ascii="Consolas" w:eastAsia="Consolas" w:hAnsi="Consolas" w:cs="Consolas"/>
-          <w:sz w:val="18"/>
-          <w:szCs w:val="18"/>
-          <w:lang w:eastAsia="fr-FR"/>
-        </w:rPr>
-        <w:t>npm</w:t>
-      </w:r>
-      <w:proofErr w:type="spellEnd"/>
-      <w:r>
-        <w:rPr>
-          <w:rFonts w:ascii="Consolas" w:eastAsia="Consolas" w:hAnsi="Consolas" w:cs="Consolas"/>
-          <w:sz w:val="18"/>
-          <w:szCs w:val="18"/>
-          <w:lang w:eastAsia="fr-FR"/>
-        </w:rPr>
-        <w:t xml:space="preserve"> run dev                   # http://localhost:3000</w:t>
-      </w:r>
-    </w:p>
-    <w:p>
-      <w:pPr>
-        <w:shd w:val="clear" w:color="auto" w:fill="F4F4F4"/>
-        <w:spacing w:after="140" w:line="240" w:lineRule="auto"/>
-        <w:rPr>
-          <w:rFonts w:ascii="Arial" w:eastAsia="Arial" w:hAnsi="Arial" w:cs="Arial"/>
-          <w:sz w:val="22"/>
-          <w:szCs w:val="22"/>
-          <w:lang w:eastAsia="fr-FR"/>
-        </w:rPr>
-      </w:pPr>
-      <w:r>
-        <w:rPr>
-          <w:rFonts w:ascii="Consolas" w:eastAsia="Consolas" w:hAnsi="Consolas" w:cs="Consolas"/>
-          <w:sz w:val="18"/>
-          <w:szCs w:val="18"/>
-          <w:lang w:eastAsia="fr-FR"/>
-        </w:rPr>
-        <w:t># 4. Agent : importer n8n/agent-</w:t>
-      </w:r>
-      <w:proofErr w:type="spellStart"/>
-      <w:r>
-        <w:rPr>
-          <w:rFonts w:ascii="Consolas" w:eastAsia="Consolas" w:hAnsi="Consolas" w:cs="Consolas"/>
-          <w:sz w:val="18"/>
-          <w:szCs w:val="18"/>
-          <w:lang w:eastAsia="fr-FR"/>
-        </w:rPr>
-        <w:t>workflow.json</w:t>
-      </w:r>
-      <w:proofErr w:type="spellEnd"/>
-      <w:r>
-        <w:rPr>
-          <w:rFonts w:ascii="Consolas" w:eastAsia="Consolas" w:hAnsi="Consolas" w:cs="Consolas"/>
-          <w:sz w:val="18"/>
-          <w:szCs w:val="18"/>
-          <w:lang w:eastAsia="fr-FR"/>
-        </w:rPr>
-        <w:t xml:space="preserve"> (+ </w:t>
-      </w:r>
-      <w:proofErr w:type="spellStart"/>
-      <w:r>
-        <w:rPr>
-          <w:rFonts w:ascii="Consolas" w:eastAsia="Consolas" w:hAnsi="Consolas" w:cs="Consolas"/>
-          <w:sz w:val="18"/>
-          <w:szCs w:val="18"/>
-          <w:lang w:eastAsia="fr-FR"/>
-        </w:rPr>
-        <w:t>credential</w:t>
-      </w:r>
-      <w:proofErr w:type="spellEnd"/>
-      <w:r>
-        <w:rPr>
-          <w:rFonts w:ascii="Consolas" w:eastAsia="Consolas" w:hAnsi="Consolas" w:cs="Consolas"/>
-          <w:sz w:val="18"/>
-          <w:szCs w:val="18"/>
-          <w:lang w:eastAsia="fr-FR"/>
-        </w:rPr>
-        <w:t xml:space="preserve"> Gemini)</w:t>
-      </w:r>
-    </w:p>
-    <w:p>
-      <w:pPr>
-        <w:spacing w:after="120" w:line="240" w:lineRule="auto"/>
-        <w:rPr>
-          <w:rFonts w:ascii="Arial" w:eastAsia="Arial" w:hAnsi="Arial" w:cs="Arial"/>
-          <w:sz w:val="22"/>
-          <w:szCs w:val="22"/>
-          <w:lang w:eastAsia="fr-FR"/>
-        </w:rPr>
-      </w:pPr>
-      <w:r>
-        <w:rPr>
-          <w:rFonts w:ascii="Arial" w:eastAsia="Arial" w:hAnsi="Arial" w:cs="Arial"/>
-          <w:sz w:val="22"/>
-          <w:szCs w:val="22"/>
-          <w:lang w:eastAsia="fr-FR"/>
-        </w:rPr>
-        <w:t>Vérif</w:t>
-      </w:r>
-      <w:r>
-        <w:rPr>
-          <w:rFonts w:ascii="Arial" w:eastAsia="Arial" w:hAnsi="Arial" w:cs="Arial"/>
-          <w:sz w:val="22"/>
-          <w:szCs w:val="22"/>
-          <w:lang w:eastAsia="fr-FR"/>
-        </w:rPr>
-        <w:t>ication</w:t>
-      </w:r>
-      <w:r>
-        <w:rPr>
-          <w:rFonts w:ascii="Arial" w:eastAsia="Arial" w:hAnsi="Arial" w:cs="Arial"/>
-          <w:sz w:val="22"/>
-          <w:szCs w:val="22"/>
-          <w:lang w:eastAsia="fr-FR"/>
-        </w:rPr>
-        <w:t xml:space="preserve"> : </w:t>
-      </w:r>
-      <w:r>
-        <w:rPr>
-          <w:rFonts w:ascii="Consolas" w:eastAsia="Consolas" w:hAnsi="Consolas" w:cs="Consolas"/>
-          <w:sz w:val="18"/>
-          <w:szCs w:val="18"/>
-          <w:lang w:eastAsia="fr-FR"/>
-        </w:rPr>
-        <w:t xml:space="preserve">cd web &amp;&amp; </w:t>
-      </w:r>
-      <w:proofErr w:type="spellStart"/>
-      <w:r>
-        <w:rPr>
-          <w:rFonts w:ascii="Consolas" w:eastAsia="Consolas" w:hAnsi="Consolas" w:cs="Consolas"/>
-          <w:sz w:val="18"/>
-          <w:szCs w:val="18"/>
-          <w:lang w:eastAsia="fr-FR"/>
-        </w:rPr>
-        <w:t>npm</w:t>
-      </w:r>
-      <w:proofErr w:type="spellEnd"/>
-      <w:r>
-        <w:rPr>
-          <w:rFonts w:ascii="Consolas" w:eastAsia="Consolas" w:hAnsi="Consolas" w:cs="Consolas"/>
-          <w:sz w:val="18"/>
-          <w:szCs w:val="18"/>
-          <w:lang w:eastAsia="fr-FR"/>
-        </w:rPr>
-        <w:t xml:space="preserve"> run </w:t>
-      </w:r>
-      <w:proofErr w:type="spellStart"/>
-      <w:r>
-        <w:rPr>
-          <w:rFonts w:ascii="Consolas" w:eastAsia="Consolas" w:hAnsi="Consolas" w:cs="Consolas"/>
-          <w:sz w:val="18"/>
-          <w:szCs w:val="18"/>
-          <w:lang w:eastAsia="fr-FR"/>
-        </w:rPr>
-        <w:t>lint</w:t>
-      </w:r>
-      <w:proofErr w:type="spellEnd"/>
-      <w:r>
-        <w:rPr>
-          <w:rFonts w:ascii="Arial" w:eastAsia="Arial" w:hAnsi="Arial" w:cs="Arial"/>
-          <w:sz w:val="22"/>
-          <w:szCs w:val="22"/>
-          <w:lang w:eastAsia="fr-FR"/>
-        </w:rPr>
-        <w:t xml:space="preserve"> (0) · </w:t>
-      </w:r>
-      <w:proofErr w:type="spellStart"/>
-      <w:r>
-        <w:rPr>
-          <w:rFonts w:ascii="Consolas" w:eastAsia="Consolas" w:hAnsi="Consolas" w:cs="Consolas"/>
-          <w:sz w:val="18"/>
-          <w:szCs w:val="18"/>
-          <w:lang w:eastAsia="fr-FR"/>
-        </w:rPr>
-        <w:t>npx</w:t>
-      </w:r>
-      <w:proofErr w:type="spellEnd"/>
-      <w:r>
-        <w:rPr>
-          <w:rFonts w:ascii="Consolas" w:eastAsia="Consolas" w:hAnsi="Consolas" w:cs="Consolas"/>
-          <w:sz w:val="18"/>
-          <w:szCs w:val="18"/>
-          <w:lang w:eastAsia="fr-FR"/>
-        </w:rPr>
-        <w:t xml:space="preserve"> </w:t>
-      </w:r>
-      <w:proofErr w:type="spellStart"/>
-      <w:r>
-        <w:rPr>
-          <w:rFonts w:ascii="Consolas" w:eastAsia="Consolas" w:hAnsi="Consolas" w:cs="Consolas"/>
-          <w:sz w:val="18"/>
-          <w:szCs w:val="18"/>
-          <w:lang w:eastAsia="fr-FR"/>
-        </w:rPr>
-        <w:t>vitest</w:t>
-      </w:r>
-      <w:proofErr w:type="spellEnd"/>
-      <w:r>
-        <w:rPr>
-          <w:rFonts w:ascii="Consolas" w:eastAsia="Consolas" w:hAnsi="Consolas" w:cs="Consolas"/>
-          <w:sz w:val="18"/>
-          <w:szCs w:val="18"/>
-          <w:lang w:eastAsia="fr-FR"/>
-        </w:rPr>
-        <w:t xml:space="preserve"> run</w:t>
-      </w:r>
-      <w:r>
-        <w:rPr>
-          <w:rFonts w:ascii="Arial" w:eastAsia="Arial" w:hAnsi="Arial" w:cs="Arial"/>
-          <w:sz w:val="22"/>
-          <w:szCs w:val="22"/>
-          <w:lang w:eastAsia="fr-FR"/>
-        </w:rPr>
-        <w:t xml:space="preserve"> · </w:t>
-      </w:r>
-      <w:proofErr w:type="spellStart"/>
-      <w:r>
-        <w:rPr>
-          <w:rFonts w:ascii="Consolas" w:eastAsia="Consolas" w:hAnsi="Consolas" w:cs="Consolas"/>
-          <w:sz w:val="18"/>
-          <w:szCs w:val="18"/>
-          <w:lang w:eastAsia="fr-FR"/>
-        </w:rPr>
-        <w:t>npm</w:t>
-      </w:r>
-      <w:proofErr w:type="spellEnd"/>
-      <w:r>
-        <w:rPr>
-          <w:rFonts w:ascii="Consolas" w:eastAsia="Consolas" w:hAnsi="Consolas" w:cs="Consolas"/>
-          <w:sz w:val="18"/>
-          <w:szCs w:val="18"/>
-          <w:lang w:eastAsia="fr-FR"/>
-        </w:rPr>
-        <w:t xml:space="preserve"> run </w:t>
-      </w:r>
-      <w:proofErr w:type="spellStart"/>
-      <w:r>
-        <w:rPr>
-          <w:rFonts w:ascii="Consolas" w:eastAsia="Consolas" w:hAnsi="Consolas" w:cs="Consolas"/>
-          <w:sz w:val="18"/>
-          <w:szCs w:val="18"/>
-          <w:lang w:eastAsia="fr-FR"/>
-        </w:rPr>
-        <w:t>build</w:t>
-      </w:r>
-      <w:proofErr w:type="spellEnd"/>
-      <w:r>
-        <w:rPr>
-          <w:rFonts w:ascii="Arial" w:eastAsia="Arial" w:hAnsi="Arial" w:cs="Arial"/>
-          <w:sz w:val="22"/>
-          <w:szCs w:val="22"/>
-          <w:lang w:eastAsia="fr-FR"/>
-        </w:rPr>
         <w:t>.</w:t>
       </w:r>
     </w:p>
@@ -5083,7 +4391,7 @@
         </w:rPr>
       </w:pPr>
       <w:bookmarkStart w:id="10" w:name="_Toc233658147"/>
-      <w:bookmarkStart w:id="11" w:name="_Toc233659540"/>
+      <w:bookmarkStart w:id="11" w:name="_Toc233660840"/>
       <w:r>
         <w:rPr>
           <w:lang w:eastAsia="fr-FR"/>
@@ -5108,35 +4416,7 @@
         <w:rPr>
           <w:lang w:eastAsia="fr-FR"/>
         </w:rPr>
-        <w:t xml:space="preserve">Prix déterministe : tout changement de tarif se fait dans </w:t>
-      </w:r>
-      <w:proofErr w:type="spellStart"/>
-      <w:r>
-        <w:rPr>
-          <w:lang w:eastAsia="fr-FR"/>
-        </w:rPr>
-        <w:t>pricing</w:t>
-      </w:r>
-      <w:proofErr w:type="spellEnd"/>
-      <w:r>
-        <w:rPr>
-          <w:lang w:eastAsia="fr-FR"/>
-        </w:rPr>
-        <w:t xml:space="preserve">/matrices.js (+ table </w:t>
-      </w:r>
-      <w:proofErr w:type="spellStart"/>
-      <w:r>
-        <w:rPr>
-          <w:lang w:eastAsia="fr-FR"/>
-        </w:rPr>
-        <w:t>pricing_config</w:t>
-      </w:r>
-      <w:proofErr w:type="spellEnd"/>
-      <w:r>
-        <w:rPr>
-          <w:lang w:eastAsia="fr-FR"/>
-        </w:rPr>
-        <w:t>), pas dans le LLM</w:t>
+        <w:t>Prix déterministe : tout changement de tarif se fait dans pricing/matrices.js (+ table pricing_config), pas dans le LLM</w:t>
       </w:r>
     </w:p>
     <w:p>
@@ -5172,49 +4452,7 @@
         <w:rPr>
           <w:lang w:eastAsia="fr-FR"/>
         </w:rPr>
-        <w:t xml:space="preserve">Sécurité : le navigateur n’a que la clé </w:t>
-      </w:r>
-      <w:proofErr w:type="spellStart"/>
-      <w:r>
-        <w:rPr>
-          <w:lang w:eastAsia="fr-FR"/>
-        </w:rPr>
-        <w:t>anon</w:t>
-      </w:r>
-      <w:proofErr w:type="spellEnd"/>
-      <w:r>
-        <w:rPr>
-          <w:lang w:eastAsia="fr-FR"/>
-        </w:rPr>
-        <w:t xml:space="preserve"> (RLS) ; les routes /api/* utilisent la service </w:t>
-      </w:r>
-      <w:proofErr w:type="spellStart"/>
-      <w:r>
-        <w:rPr>
-          <w:lang w:eastAsia="fr-FR"/>
-        </w:rPr>
-        <w:t>role</w:t>
-      </w:r>
-      <w:proofErr w:type="spellEnd"/>
-      <w:r>
-        <w:rPr>
-          <w:lang w:eastAsia="fr-FR"/>
-        </w:rPr>
-        <w:t xml:space="preserve"> côté serveur après vérification du </w:t>
-      </w:r>
-      <w:proofErr w:type="spellStart"/>
-      <w:r>
-        <w:rPr>
-          <w:lang w:eastAsia="fr-FR"/>
-        </w:rPr>
-        <w:t>token</w:t>
-      </w:r>
-      <w:proofErr w:type="spellEnd"/>
-      <w:r>
-        <w:rPr>
-          <w:lang w:eastAsia="fr-FR"/>
-        </w:rPr>
-        <w:t>/rôle</w:t>
+        <w:t>Sécurité : le navigateur n’a que la clé anon (RLS) ; les routes /api/* utilisent la service role côté serveur après vérification du token/rôle</w:t>
       </w:r>
     </w:p>
     <w:p>
@@ -5228,61 +4466,11 @@
           <w:lang w:eastAsia="fr-FR"/>
         </w:rPr>
       </w:pPr>
-      <w:proofErr w:type="gramStart"/>
-      <w:r>
-        <w:rPr>
-          <w:lang w:eastAsia="fr-FR"/>
-        </w:rPr>
-        <w:t>Emails</w:t>
-      </w:r>
-      <w:proofErr w:type="gramEnd"/>
-      <w:r>
-        <w:rPr>
-          <w:lang w:eastAsia="fr-FR"/>
-        </w:rPr>
-        <w:t xml:space="preserve"> </w:t>
-      </w:r>
-      <w:proofErr w:type="spellStart"/>
-      <w:r>
-        <w:rPr>
-          <w:lang w:eastAsia="fr-FR"/>
-        </w:rPr>
-        <w:t>serverless</w:t>
-      </w:r>
-      <w:proofErr w:type="spellEnd"/>
-      <w:r>
-        <w:rPr>
-          <w:lang w:eastAsia="fr-FR"/>
-        </w:rPr>
-        <w:t xml:space="preserve"> : on attend (</w:t>
-      </w:r>
-      <w:proofErr w:type="spellStart"/>
-      <w:r>
-        <w:rPr>
-          <w:lang w:eastAsia="fr-FR"/>
-        </w:rPr>
-        <w:t>await</w:t>
-      </w:r>
-      <w:proofErr w:type="spellEnd"/>
-      <w:r>
-        <w:rPr>
-          <w:lang w:eastAsia="fr-FR"/>
-        </w:rPr>
-        <w:t xml:space="preserve">) la persistance avant de répondre dans /api/chat (sinon </w:t>
-      </w:r>
-      <w:proofErr w:type="gramStart"/>
-      <w:r>
-        <w:rPr>
-          <w:lang w:eastAsia="fr-FR"/>
-        </w:rPr>
-        <w:t>l’email</w:t>
-      </w:r>
-      <w:proofErr w:type="gramEnd"/>
-      <w:r>
-        <w:rPr>
-          <w:lang w:eastAsia="fr-FR"/>
-        </w:rPr>
-        <w:t xml:space="preserve"> ne partirait pas)</w:t>
+      <w:r>
+        <w:rPr>
+          <w:lang w:eastAsia="fr-FR"/>
+        </w:rPr>
+        <w:t>Emails serverless : on attend (await) la persistance avant de répondre dans /api/chat (sinon l’email ne partirait pas)</w:t>
       </w:r>
     </w:p>
     <w:p>
@@ -5296,19 +4484,11 @@
           <w:lang w:eastAsia="fr-FR"/>
         </w:rPr>
       </w:pPr>
-      <w:proofErr w:type="gramStart"/>
-      <w:r>
-        <w:rPr>
-          <w:lang w:eastAsia="fr-FR"/>
-        </w:rPr>
-        <w:t>n</w:t>
-      </w:r>
-      <w:proofErr w:type="gramEnd"/>
-      <w:r>
-        <w:rPr>
-          <w:lang w:eastAsia="fr-FR"/>
-        </w:rPr>
-        <w:t>8n en tunnel = choix MVP (0 €, PC allumé). Pour la prod 24/7 → n8n hébergé (voir COUTS_ET_PROD.md)</w:t>
+      <w:r>
+        <w:rPr>
+          <w:lang w:eastAsia="fr-FR"/>
+        </w:rPr>
+        <w:t>n8n en tunnel = choix MVP (0 €, PC allumé). Pour la prod 24/7 → n8n hébergé (voir COUTS_ET_PROD.md)</w:t>
       </w:r>
     </w:p>
     <w:p>
@@ -5319,7 +4499,7 @@
         </w:rPr>
       </w:pPr>
       <w:bookmarkStart w:id="12" w:name="_Toc233658148"/>
-      <w:bookmarkStart w:id="13" w:name="_Toc233659541"/>
+      <w:bookmarkStart w:id="13" w:name="_Toc233660841"/>
       <w:r>
         <w:rPr>
           <w:lang w:eastAsia="fr-FR"/>
@@ -5366,12 +4546,6 @@
         <w:gridCol w:w="7160"/>
       </w:tblGrid>
       <w:tr>
-        <w:tblPrEx>
-          <w:tblCellMar>
-            <w:top w:w="0" w:type="dxa"/>
-            <w:bottom w:w="0" w:type="dxa"/>
-          </w:tblCellMar>
-        </w:tblPrEx>
         <w:trPr>
           <w:tblHeader/>
           <w:jc w:val="center"/>
@@ -5448,12 +4622,6 @@
         </w:tc>
       </w:tr>
       <w:tr>
-        <w:tblPrEx>
-          <w:tblCellMar>
-            <w:top w:w="0" w:type="dxa"/>
-            <w:bottom w:w="0" w:type="dxa"/>
-          </w:tblCellMar>
-        </w:tblPrEx>
         <w:trPr>
           <w:trHeight w:val="506"/>
           <w:jc w:val="center"/>
@@ -5479,7 +4647,6 @@
                 <w:lang w:eastAsia="fr-FR"/>
               </w:rPr>
             </w:pPr>
-            <w:proofErr w:type="gramStart"/>
             <w:r>
               <w:rPr>
                 <w:rFonts w:eastAsia="Arial" w:cs="Arial"/>
@@ -5488,18 +4655,7 @@
                 <w:szCs w:val="22"/>
                 <w:lang w:eastAsia="fr-FR"/>
               </w:rPr>
-              <w:t>web</w:t>
-            </w:r>
-            <w:proofErr w:type="gramEnd"/>
-            <w:r>
-              <w:rPr>
-                <w:rFonts w:eastAsia="Arial" w:cs="Arial"/>
-                <w:color w:val="000000"/>
-                <w:sz w:val="22"/>
-                <w:szCs w:val="22"/>
-                <w:lang w:eastAsia="fr-FR"/>
-              </w:rPr>
-              <w:t>/app/</w:t>
+              <w:t>web/app/</w:t>
             </w:r>
           </w:p>
         </w:tc>
@@ -5538,12 +4694,6 @@
         </w:tc>
       </w:tr>
       <w:tr>
-        <w:tblPrEx>
-          <w:tblCellMar>
-            <w:top w:w="0" w:type="dxa"/>
-            <w:bottom w:w="0" w:type="dxa"/>
-          </w:tblCellMar>
-        </w:tblPrEx>
         <w:trPr>
           <w:trHeight w:val="506"/>
           <w:jc w:val="center"/>
@@ -5569,7 +4719,6 @@
                 <w:lang w:eastAsia="fr-FR"/>
               </w:rPr>
             </w:pPr>
-            <w:proofErr w:type="gramStart"/>
             <w:r>
               <w:rPr>
                 <w:rFonts w:eastAsia="Arial" w:cs="Arial"/>
@@ -5578,9 +4727,31 @@
                 <w:szCs w:val="22"/>
                 <w:lang w:eastAsia="fr-FR"/>
               </w:rPr>
-              <w:t>web</w:t>
-            </w:r>
-            <w:proofErr w:type="gramEnd"/>
+              <w:t>web/app/api/</w:t>
+            </w:r>
+          </w:p>
+        </w:tc>
+        <w:tc>
+          <w:tcPr>
+            <w:tcW w:w="7160" w:type="dxa"/>
+            <w:tcMar>
+              <w:top w:w="60" w:type="dxa"/>
+              <w:left w:w="110" w:type="dxa"/>
+              <w:bottom w:w="60" w:type="dxa"/>
+              <w:right w:w="110" w:type="dxa"/>
+            </w:tcMar>
+            <w:vAlign w:val="center"/>
+          </w:tcPr>
+          <w:p>
+            <w:pPr>
+              <w:spacing w:after="0" w:line="240" w:lineRule="auto"/>
+              <w:rPr>
+                <w:rFonts w:eastAsia="Arial" w:cs="Arial"/>
+                <w:sz w:val="22"/>
+                <w:szCs w:val="22"/>
+                <w:lang w:eastAsia="fr-FR"/>
+              </w:rPr>
+            </w:pPr>
             <w:r>
               <w:rPr>
                 <w:rFonts w:eastAsia="Arial" w:cs="Arial"/>
@@ -5589,73 +4760,12 @@
                 <w:szCs w:val="22"/>
                 <w:lang w:eastAsia="fr-FR"/>
               </w:rPr>
-              <w:t>/app/api/</w:t>
-            </w:r>
-          </w:p>
-        </w:tc>
-        <w:tc>
-          <w:tcPr>
-            <w:tcW w:w="7160" w:type="dxa"/>
-            <w:tcMar>
-              <w:top w:w="60" w:type="dxa"/>
-              <w:left w:w="110" w:type="dxa"/>
-              <w:bottom w:w="60" w:type="dxa"/>
-              <w:right w:w="110" w:type="dxa"/>
-            </w:tcMar>
-            <w:vAlign w:val="center"/>
-          </w:tcPr>
-          <w:p>
-            <w:pPr>
-              <w:spacing w:after="0" w:line="240" w:lineRule="auto"/>
-              <w:rPr>
-                <w:rFonts w:eastAsia="Arial" w:cs="Arial"/>
-                <w:sz w:val="22"/>
-                <w:szCs w:val="22"/>
-                <w:lang w:eastAsia="fr-FR"/>
-              </w:rPr>
-            </w:pPr>
-            <w:r>
-              <w:rPr>
-                <w:rFonts w:eastAsia="Arial" w:cs="Arial"/>
-                <w:color w:val="000000"/>
-                <w:sz w:val="22"/>
-                <w:szCs w:val="22"/>
-                <w:lang w:eastAsia="fr-FR"/>
-              </w:rPr>
-              <w:t>Toute la logique métier (chat, relances, admin-data, devis-</w:t>
-            </w:r>
-            <w:proofErr w:type="spellStart"/>
-            <w:r>
-              <w:rPr>
-                <w:rFonts w:eastAsia="Arial" w:cs="Arial"/>
-                <w:color w:val="000000"/>
-                <w:sz w:val="22"/>
-                <w:szCs w:val="22"/>
-                <w:lang w:eastAsia="fr-FR"/>
-              </w:rPr>
-              <w:t>pdf</w:t>
-            </w:r>
-            <w:proofErr w:type="spellEnd"/>
-            <w:r>
-              <w:rPr>
-                <w:rFonts w:eastAsia="Arial" w:cs="Arial"/>
-                <w:color w:val="000000"/>
-                <w:sz w:val="22"/>
-                <w:szCs w:val="22"/>
-                <w:lang w:eastAsia="fr-FR"/>
-              </w:rPr>
-              <w:t>…)</w:t>
+              <w:t>Toute la logique métier (chat, relances, admin-data, devis-pdf…)</w:t>
             </w:r>
           </w:p>
         </w:tc>
       </w:tr>
       <w:tr>
-        <w:tblPrEx>
-          <w:tblCellMar>
-            <w:top w:w="0" w:type="dxa"/>
-            <w:bottom w:w="0" w:type="dxa"/>
-          </w:tblCellMar>
-        </w:tblPrEx>
         <w:trPr>
           <w:trHeight w:val="506"/>
           <w:jc w:val="center"/>
@@ -5681,7 +4791,6 @@
                 <w:lang w:eastAsia="fr-FR"/>
               </w:rPr>
             </w:pPr>
-            <w:proofErr w:type="gramStart"/>
             <w:r>
               <w:rPr>
                 <w:rFonts w:eastAsia="Arial" w:cs="Arial"/>
@@ -5690,9 +4799,31 @@
                 <w:szCs w:val="22"/>
                 <w:lang w:eastAsia="fr-FR"/>
               </w:rPr>
-              <w:t>web</w:t>
-            </w:r>
-            <w:proofErr w:type="gramEnd"/>
+              <w:t>web/lib/</w:t>
+            </w:r>
+          </w:p>
+        </w:tc>
+        <w:tc>
+          <w:tcPr>
+            <w:tcW w:w="7160" w:type="dxa"/>
+            <w:tcMar>
+              <w:top w:w="60" w:type="dxa"/>
+              <w:left w:w="110" w:type="dxa"/>
+              <w:bottom w:w="60" w:type="dxa"/>
+              <w:right w:w="110" w:type="dxa"/>
+            </w:tcMar>
+            <w:vAlign w:val="center"/>
+          </w:tcPr>
+          <w:p>
+            <w:pPr>
+              <w:spacing w:after="0" w:line="240" w:lineRule="auto"/>
+              <w:rPr>
+                <w:rFonts w:eastAsia="Arial" w:cs="Arial"/>
+                <w:sz w:val="22"/>
+                <w:szCs w:val="22"/>
+                <w:lang w:eastAsia="fr-FR"/>
+              </w:rPr>
+            </w:pPr>
             <w:r>
               <w:rPr>
                 <w:rFonts w:eastAsia="Arial" w:cs="Arial"/>
@@ -5701,117 +4832,12 @@
                 <w:szCs w:val="22"/>
                 <w:lang w:eastAsia="fr-FR"/>
               </w:rPr>
-              <w:t>/lib/</w:t>
-            </w:r>
-          </w:p>
-        </w:tc>
-        <w:tc>
-          <w:tcPr>
-            <w:tcW w:w="7160" w:type="dxa"/>
-            <w:tcMar>
-              <w:top w:w="60" w:type="dxa"/>
-              <w:left w:w="110" w:type="dxa"/>
-              <w:bottom w:w="60" w:type="dxa"/>
-              <w:right w:w="110" w:type="dxa"/>
-            </w:tcMar>
-            <w:vAlign w:val="center"/>
-          </w:tcPr>
-          <w:p>
-            <w:pPr>
-              <w:spacing w:after="0" w:line="240" w:lineRule="auto"/>
-              <w:rPr>
-                <w:rFonts w:eastAsia="Arial" w:cs="Arial"/>
-                <w:sz w:val="22"/>
-                <w:szCs w:val="22"/>
-                <w:lang w:eastAsia="fr-FR"/>
-              </w:rPr>
-            </w:pPr>
-            <w:r>
-              <w:rPr>
-                <w:rFonts w:eastAsia="Arial" w:cs="Arial"/>
-                <w:color w:val="000000"/>
-                <w:sz w:val="22"/>
-                <w:szCs w:val="22"/>
-                <w:lang w:eastAsia="fr-FR"/>
-              </w:rPr>
-              <w:t>Fonctions réutilisables &amp; testées (</w:t>
-            </w:r>
-            <w:proofErr w:type="spellStart"/>
-            <w:r>
-              <w:rPr>
-                <w:rFonts w:eastAsia="Arial" w:cs="Arial"/>
-                <w:color w:val="000000"/>
-                <w:sz w:val="22"/>
-                <w:szCs w:val="22"/>
-                <w:lang w:eastAsia="fr-FR"/>
-              </w:rPr>
-              <w:t>calculerDevis</w:t>
-            </w:r>
-            <w:proofErr w:type="spellEnd"/>
-            <w:r>
-              <w:rPr>
-                <w:rFonts w:eastAsia="Arial" w:cs="Arial"/>
-                <w:color w:val="000000"/>
-                <w:sz w:val="22"/>
-                <w:szCs w:val="22"/>
-                <w:lang w:eastAsia="fr-FR"/>
-              </w:rPr>
-              <w:t xml:space="preserve">, distance, </w:t>
-            </w:r>
-            <w:proofErr w:type="spellStart"/>
-            <w:r>
-              <w:rPr>
-                <w:rFonts w:eastAsia="Arial" w:cs="Arial"/>
-                <w:color w:val="000000"/>
-                <w:sz w:val="22"/>
-                <w:szCs w:val="22"/>
-                <w:lang w:eastAsia="fr-FR"/>
-              </w:rPr>
-              <w:t>devisPdf</w:t>
-            </w:r>
-            <w:proofErr w:type="spellEnd"/>
-            <w:r>
-              <w:rPr>
-                <w:rFonts w:eastAsia="Arial" w:cs="Arial"/>
-                <w:color w:val="000000"/>
-                <w:sz w:val="22"/>
-                <w:szCs w:val="22"/>
-                <w:lang w:eastAsia="fr-FR"/>
-              </w:rPr>
-              <w:t xml:space="preserve">, </w:t>
-            </w:r>
-            <w:proofErr w:type="spellStart"/>
-            <w:r>
-              <w:rPr>
-                <w:rFonts w:eastAsia="Arial" w:cs="Arial"/>
-                <w:color w:val="000000"/>
-                <w:sz w:val="22"/>
-                <w:szCs w:val="22"/>
-                <w:lang w:eastAsia="fr-FR"/>
-              </w:rPr>
-              <w:t>emailDevis</w:t>
-            </w:r>
-            <w:proofErr w:type="spellEnd"/>
-            <w:r>
-              <w:rPr>
-                <w:rFonts w:eastAsia="Arial" w:cs="Arial"/>
-                <w:color w:val="000000"/>
-                <w:sz w:val="22"/>
-                <w:szCs w:val="22"/>
-                <w:lang w:eastAsia="fr-FR"/>
-              </w:rPr>
-              <w:t>, relances…)</w:t>
+              <w:t>Fonctions réutilisables &amp; testées (calculerDevis, distance, devisPdf, emailDevis, relances…)</w:t>
             </w:r>
           </w:p>
         </w:tc>
       </w:tr>
       <w:tr>
-        <w:tblPrEx>
-          <w:tblCellMar>
-            <w:top w:w="0" w:type="dxa"/>
-            <w:bottom w:w="0" w:type="dxa"/>
-          </w:tblCellMar>
-        </w:tblPrEx>
         <w:trPr>
           <w:trHeight w:val="506"/>
           <w:jc w:val="center"/>
@@ -5837,8 +4863,6 @@
                 <w:lang w:eastAsia="fr-FR"/>
               </w:rPr>
             </w:pPr>
-            <w:proofErr w:type="spellStart"/>
-            <w:proofErr w:type="gramStart"/>
             <w:r>
               <w:rPr>
                 <w:rFonts w:eastAsia="Arial" w:cs="Arial"/>
@@ -5847,19 +4871,7 @@
                 <w:szCs w:val="22"/>
                 <w:lang w:eastAsia="fr-FR"/>
               </w:rPr>
-              <w:t>pricing</w:t>
-            </w:r>
-            <w:proofErr w:type="spellEnd"/>
-            <w:proofErr w:type="gramEnd"/>
-            <w:r>
-              <w:rPr>
-                <w:rFonts w:eastAsia="Arial" w:cs="Arial"/>
-                <w:color w:val="000000"/>
-                <w:sz w:val="22"/>
-                <w:szCs w:val="22"/>
-                <w:lang w:eastAsia="fr-FR"/>
-              </w:rPr>
-              <w:t>/</w:t>
+              <w:t>pricing/</w:t>
             </w:r>
           </w:p>
         </w:tc>
@@ -5898,12 +4910,6 @@
         </w:tc>
       </w:tr>
       <w:tr>
-        <w:tblPrEx>
-          <w:tblCellMar>
-            <w:top w:w="0" w:type="dxa"/>
-            <w:bottom w:w="0" w:type="dxa"/>
-          </w:tblCellMar>
-        </w:tblPrEx>
         <w:trPr>
           <w:trHeight w:val="506"/>
           <w:jc w:val="center"/>
@@ -5929,7 +4935,6 @@
                 <w:lang w:eastAsia="fr-FR"/>
               </w:rPr>
             </w:pPr>
-            <w:proofErr w:type="gramStart"/>
             <w:r>
               <w:rPr>
                 <w:rFonts w:eastAsia="Arial" w:cs="Arial"/>
@@ -5938,18 +4943,7 @@
                 <w:szCs w:val="22"/>
                 <w:lang w:eastAsia="fr-FR"/>
               </w:rPr>
-              <w:t>n</w:t>
-            </w:r>
-            <w:proofErr w:type="gramEnd"/>
-            <w:r>
-              <w:rPr>
-                <w:rFonts w:eastAsia="Arial" w:cs="Arial"/>
-                <w:color w:val="000000"/>
-                <w:sz w:val="22"/>
-                <w:szCs w:val="22"/>
-                <w:lang w:eastAsia="fr-FR"/>
-              </w:rPr>
-              <w:t>8n/</w:t>
+              <w:t>n8n/</w:t>
             </w:r>
           </w:p>
         </w:tc>
@@ -5988,12 +4982,6 @@
         </w:tc>
       </w:tr>
       <w:tr>
-        <w:tblPrEx>
-          <w:tblCellMar>
-            <w:top w:w="0" w:type="dxa"/>
-            <w:bottom w:w="0" w:type="dxa"/>
-          </w:tblCellMar>
-        </w:tblPrEx>
         <w:trPr>
           <w:trHeight w:val="506"/>
           <w:jc w:val="center"/>
@@ -6019,8 +5007,6 @@
                 <w:lang w:eastAsia="fr-FR"/>
               </w:rPr>
             </w:pPr>
-            <w:proofErr w:type="spellStart"/>
-            <w:proofErr w:type="gramStart"/>
             <w:r>
               <w:rPr>
                 <w:rFonts w:eastAsia="Arial" w:cs="Arial"/>
@@ -6030,10 +5016,31 @@
                 <w:lang w:eastAsia="fr-FR"/>
               </w:rPr>
               <w:lastRenderedPageBreak/>
-              <w:t>supabase</w:t>
-            </w:r>
-            <w:proofErr w:type="spellEnd"/>
-            <w:proofErr w:type="gramEnd"/>
+              <w:t>supabase/</w:t>
+            </w:r>
+          </w:p>
+        </w:tc>
+        <w:tc>
+          <w:tcPr>
+            <w:tcW w:w="7160" w:type="dxa"/>
+            <w:tcMar>
+              <w:top w:w="60" w:type="dxa"/>
+              <w:left w:w="110" w:type="dxa"/>
+              <w:bottom w:w="60" w:type="dxa"/>
+              <w:right w:w="110" w:type="dxa"/>
+            </w:tcMar>
+            <w:vAlign w:val="center"/>
+          </w:tcPr>
+          <w:p>
+            <w:pPr>
+              <w:spacing w:after="0" w:line="240" w:lineRule="auto"/>
+              <w:rPr>
+                <w:rFonts w:eastAsia="Arial" w:cs="Arial"/>
+                <w:sz w:val="22"/>
+                <w:szCs w:val="22"/>
+                <w:lang w:eastAsia="fr-FR"/>
+              </w:rPr>
+            </w:pPr>
             <w:r>
               <w:rPr>
                 <w:rFonts w:eastAsia="Arial" w:cs="Arial"/>
@@ -6042,62 +5049,7 @@
                 <w:szCs w:val="22"/>
                 <w:lang w:eastAsia="fr-FR"/>
               </w:rPr>
-              <w:t>/</w:t>
-            </w:r>
-          </w:p>
-        </w:tc>
-        <w:tc>
-          <w:tcPr>
-            <w:tcW w:w="7160" w:type="dxa"/>
-            <w:tcMar>
-              <w:top w:w="60" w:type="dxa"/>
-              <w:left w:w="110" w:type="dxa"/>
-              <w:bottom w:w="60" w:type="dxa"/>
-              <w:right w:w="110" w:type="dxa"/>
-            </w:tcMar>
-            <w:vAlign w:val="center"/>
-          </w:tcPr>
-          <w:p>
-            <w:pPr>
-              <w:spacing w:after="0" w:line="240" w:lineRule="auto"/>
-              <w:rPr>
-                <w:rFonts w:eastAsia="Arial" w:cs="Arial"/>
-                <w:sz w:val="22"/>
-                <w:szCs w:val="22"/>
-                <w:lang w:eastAsia="fr-FR"/>
-              </w:rPr>
-            </w:pPr>
-            <w:r>
-              <w:rPr>
-                <w:rFonts w:eastAsia="Arial" w:cs="Arial"/>
-                <w:color w:val="000000"/>
-                <w:sz w:val="22"/>
-                <w:szCs w:val="22"/>
-                <w:lang w:eastAsia="fr-FR"/>
-              </w:rPr>
-              <w:t xml:space="preserve">Schéma SQL, </w:t>
-            </w:r>
-            <w:proofErr w:type="spellStart"/>
-            <w:r>
-              <w:rPr>
-                <w:rFonts w:eastAsia="Arial" w:cs="Arial"/>
-                <w:color w:val="000000"/>
-                <w:sz w:val="22"/>
-                <w:szCs w:val="22"/>
-                <w:lang w:eastAsia="fr-FR"/>
-              </w:rPr>
-              <w:t>resets</w:t>
-            </w:r>
-            <w:proofErr w:type="spellEnd"/>
-            <w:r>
-              <w:rPr>
-                <w:rFonts w:eastAsia="Arial" w:cs="Arial"/>
-                <w:color w:val="000000"/>
-                <w:sz w:val="22"/>
-                <w:szCs w:val="22"/>
-                <w:lang w:eastAsia="fr-FR"/>
-              </w:rPr>
-              <w:t>, jeux de données, SCHEMA.md</w:t>
+              <w:t>Schéma SQL, resets, jeux de données, SCHEMA.md</w:t>
             </w:r>
           </w:p>
         </w:tc>
@@ -6111,7 +5063,7 @@
         </w:rPr>
       </w:pPr>
       <w:bookmarkStart w:id="14" w:name="_Toc233658149"/>
-      <w:bookmarkStart w:id="15" w:name="_Toc233659542"/>
+      <w:bookmarkStart w:id="15" w:name="_Toc233660842"/>
       <w:r>
         <w:rPr>
           <w:lang w:eastAsia="fr-FR"/>
@@ -6148,63 +5100,7 @@
         <w:rPr>
           <w:lang w:eastAsia="fr-FR"/>
         </w:rPr>
-        <w:t xml:space="preserve">. Variables sur </w:t>
-      </w:r>
-      <w:proofErr w:type="spellStart"/>
-      <w:r>
-        <w:rPr>
-          <w:lang w:eastAsia="fr-FR"/>
-        </w:rPr>
-        <w:t>Netlify</w:t>
-      </w:r>
-      <w:proofErr w:type="spellEnd"/>
-      <w:r>
-        <w:rPr>
-          <w:lang w:eastAsia="fr-FR"/>
-        </w:rPr>
-        <w:t xml:space="preserve"> : </w:t>
-      </w:r>
-      <w:proofErr w:type="spellStart"/>
-      <w:r>
-        <w:rPr>
-          <w:lang w:eastAsia="fr-FR"/>
-        </w:rPr>
-        <w:t>Supabase</w:t>
-      </w:r>
-      <w:proofErr w:type="spellEnd"/>
-      <w:r>
-        <w:rPr>
-          <w:lang w:eastAsia="fr-FR"/>
-        </w:rPr>
-        <w:t xml:space="preserve"> (URL, </w:t>
-      </w:r>
-      <w:proofErr w:type="spellStart"/>
-      <w:r>
-        <w:rPr>
-          <w:lang w:eastAsia="fr-FR"/>
-        </w:rPr>
-        <w:t>anon</w:t>
-      </w:r>
-      <w:proofErr w:type="spellEnd"/>
-      <w:r>
-        <w:rPr>
-          <w:lang w:eastAsia="fr-FR"/>
-        </w:rPr>
-        <w:t xml:space="preserve">, </w:t>
-      </w:r>
-      <w:proofErr w:type="spellStart"/>
-      <w:r>
-        <w:rPr>
-          <w:lang w:eastAsia="fr-FR"/>
-        </w:rPr>
-        <w:t>service_role</w:t>
-      </w:r>
-      <w:proofErr w:type="spellEnd"/>
-      <w:r>
-        <w:rPr>
-          <w:lang w:eastAsia="fr-FR"/>
-        </w:rPr>
-        <w:t xml:space="preserve">), </w:t>
+        <w:t xml:space="preserve">. Variables sur Netlify : Supabase (URL, anon, service_role), </w:t>
       </w:r>
       <w:r>
         <w:rPr>
@@ -6236,7 +5132,6 @@
         </w:rPr>
         <w:t xml:space="preserve">, </w:t>
       </w:r>
-      <w:proofErr w:type="gramStart"/>
       <w:r>
         <w:rPr>
           <w:rFonts w:ascii="Consolas" w:eastAsia="Consolas" w:hAnsi="Consolas" w:cs="Consolas"/>
@@ -6244,9 +5139,14 @@
           <w:szCs w:val="18"/>
           <w:lang w:eastAsia="fr-FR"/>
         </w:rPr>
-        <w:t>EMAIL</w:t>
-      </w:r>
-      <w:proofErr w:type="gramEnd"/>
+        <w:t>EMAIL_FROM</w:t>
+      </w:r>
+      <w:r>
+        <w:rPr>
+          <w:lang w:eastAsia="fr-FR"/>
+        </w:rPr>
+        <w:t xml:space="preserve">, </w:t>
+      </w:r>
       <w:r>
         <w:rPr>
           <w:rFonts w:ascii="Consolas" w:eastAsia="Consolas" w:hAnsi="Consolas" w:cs="Consolas"/>
@@ -6254,7 +5154,7 @@
           <w:szCs w:val="18"/>
           <w:lang w:eastAsia="fr-FR"/>
         </w:rPr>
-        <w:t>_FROM</w:t>
+        <w:t>CRON_SECRET</w:t>
       </w:r>
       <w:r>
         <w:rPr>
@@ -6269,21 +5169,6 @@
           <w:szCs w:val="18"/>
           <w:lang w:eastAsia="fr-FR"/>
         </w:rPr>
-        <w:t>CRON_SECRET</w:t>
-      </w:r>
-      <w:r>
-        <w:rPr>
-          <w:lang w:eastAsia="fr-FR"/>
-        </w:rPr>
-        <w:t xml:space="preserve">, </w:t>
-      </w:r>
-      <w:r>
-        <w:rPr>
-          <w:rFonts w:ascii="Consolas" w:eastAsia="Consolas" w:hAnsi="Consolas" w:cs="Consolas"/>
-          <w:sz w:val="18"/>
-          <w:szCs w:val="18"/>
-          <w:lang w:eastAsia="fr-FR"/>
-        </w:rPr>
         <w:t>NEXT_PUBLIC_SITE_URL</w:t>
       </w:r>
       <w:r>
@@ -6301,26 +5186,12 @@
         </w:rPr>
       </w:pPr>
       <w:bookmarkStart w:id="16" w:name="_Toc233658150"/>
-      <w:bookmarkStart w:id="17" w:name="_Toc233659543"/>
-      <w:r>
-        <w:rPr>
-          <w:lang w:eastAsia="fr-FR"/>
-        </w:rPr>
-        <w:t xml:space="preserve">Partie B — Procédure « équipe </w:t>
-      </w:r>
-      <w:proofErr w:type="spellStart"/>
-      <w:r>
-        <w:rPr>
-          <w:lang w:eastAsia="fr-FR"/>
-        </w:rPr>
-        <w:t>NeoTravel</w:t>
-      </w:r>
-      <w:proofErr w:type="spellEnd"/>
-      <w:r>
-        <w:rPr>
-          <w:lang w:eastAsia="fr-FR"/>
-        </w:rPr>
-        <w:t xml:space="preserve"> »</w:t>
+      <w:bookmarkStart w:id="17" w:name="_Toc233660843"/>
+      <w:r>
+        <w:rPr>
+          <w:lang w:eastAsia="fr-FR"/>
+        </w:rPr>
+        <w:t>Partie B — Procédure « équipe NeoTravel »</w:t>
       </w:r>
       <w:bookmarkEnd w:id="16"/>
       <w:bookmarkEnd w:id="17"/>
@@ -6347,7 +5218,7 @@
         </w:rPr>
       </w:pPr>
       <w:bookmarkStart w:id="18" w:name="_Toc233658151"/>
-      <w:bookmarkStart w:id="19" w:name="_Toc233659544"/>
+      <w:bookmarkStart w:id="19" w:name="_Toc233660844"/>
       <w:r>
         <w:rPr>
           <w:lang w:eastAsia="fr-FR"/>
@@ -6394,12 +5265,6 @@
         <w:gridCol w:w="6360"/>
       </w:tblGrid>
       <w:tr>
-        <w:tblPrEx>
-          <w:tblCellMar>
-            <w:top w:w="0" w:type="dxa"/>
-            <w:bottom w:w="0" w:type="dxa"/>
-          </w:tblCellMar>
-        </w:tblPrEx>
         <w:trPr>
           <w:trHeight w:val="537"/>
           <w:tblHeader/>
@@ -6477,12 +5342,6 @@
         </w:tc>
       </w:tr>
       <w:tr>
-        <w:tblPrEx>
-          <w:tblCellMar>
-            <w:top w:w="0" w:type="dxa"/>
-            <w:bottom w:w="0" w:type="dxa"/>
-          </w:tblCellMar>
-        </w:tblPrEx>
         <w:trPr>
           <w:trHeight w:val="537"/>
           <w:jc w:val="center"/>
@@ -6555,12 +5414,6 @@
         </w:tc>
       </w:tr>
       <w:tr>
-        <w:tblPrEx>
-          <w:tblCellMar>
-            <w:top w:w="0" w:type="dxa"/>
-            <w:bottom w:w="0" w:type="dxa"/>
-          </w:tblCellMar>
-        </w:tblPrEx>
         <w:trPr>
           <w:trHeight w:val="537"/>
           <w:jc w:val="center"/>
@@ -6594,20 +5447,8 @@
                 <w:szCs w:val="22"/>
                 <w:lang w:eastAsia="fr-FR"/>
               </w:rPr>
-              <w:t xml:space="preserve">Agent IA / </w:t>
-            </w:r>
-            <w:proofErr w:type="spellStart"/>
-            <w:r>
-              <w:rPr>
-                <w:rFonts w:eastAsia="Arial" w:cs="Arial"/>
-                <w:color w:val="000000"/>
-                <w:sz w:val="22"/>
-                <w:szCs w:val="22"/>
-                <w:lang w:eastAsia="fr-FR"/>
-              </w:rPr>
-              <w:t>chatbot</w:t>
-            </w:r>
-            <w:proofErr w:type="spellEnd"/>
+              <w:t>Agent IA / chatbot</w:t>
+            </w:r>
           </w:p>
         </w:tc>
         <w:tc>
@@ -6645,12 +5486,6 @@
         </w:tc>
       </w:tr>
       <w:tr>
-        <w:tblPrEx>
-          <w:tblCellMar>
-            <w:top w:w="0" w:type="dxa"/>
-            <w:bottom w:w="0" w:type="dxa"/>
-          </w:tblCellMar>
-        </w:tblPrEx>
         <w:trPr>
           <w:trHeight w:val="537"/>
           <w:jc w:val="center"/>
@@ -6723,12 +5558,6 @@
         </w:tc>
       </w:tr>
       <w:tr>
-        <w:tblPrEx>
-          <w:tblCellMar>
-            <w:top w:w="0" w:type="dxa"/>
-            <w:bottom w:w="0" w:type="dxa"/>
-          </w:tblCellMar>
-        </w:tblPrEx>
         <w:trPr>
           <w:trHeight w:val="537"/>
           <w:jc w:val="center"/>
@@ -6801,12 +5630,6 @@
         </w:tc>
       </w:tr>
       <w:tr>
-        <w:tblPrEx>
-          <w:tblCellMar>
-            <w:top w:w="0" w:type="dxa"/>
-            <w:bottom w:w="0" w:type="dxa"/>
-          </w:tblCellMar>
-        </w:tblPrEx>
         <w:trPr>
           <w:trHeight w:val="537"/>
           <w:jc w:val="center"/>
@@ -6879,12 +5702,6 @@
         </w:tc>
       </w:tr>
       <w:tr>
-        <w:tblPrEx>
-          <w:tblCellMar>
-            <w:top w:w="0" w:type="dxa"/>
-            <w:bottom w:w="0" w:type="dxa"/>
-          </w:tblCellMar>
-        </w:tblPrEx>
         <w:trPr>
           <w:trHeight w:val="537"/>
           <w:jc w:val="center"/>
@@ -6957,12 +5774,6 @@
         </w:tc>
       </w:tr>
       <w:tr>
-        <w:tblPrEx>
-          <w:tblCellMar>
-            <w:top w:w="0" w:type="dxa"/>
-            <w:bottom w:w="0" w:type="dxa"/>
-          </w:tblCellMar>
-        </w:tblPrEx>
         <w:trPr>
           <w:trHeight w:val="537"/>
           <w:jc w:val="center"/>
@@ -7021,7 +5832,6 @@
                 <w:lang w:eastAsia="fr-FR"/>
               </w:rPr>
             </w:pPr>
-            <w:proofErr w:type="gramStart"/>
             <w:r>
               <w:rPr>
                 <w:rFonts w:eastAsia="Arial" w:cs="Arial"/>
@@ -7030,29 +5840,12 @@
                 <w:szCs w:val="22"/>
                 <w:lang w:eastAsia="fr-FR"/>
               </w:rPr>
-              <w:t>Email</w:t>
-            </w:r>
-            <w:proofErr w:type="gramEnd"/>
-            <w:r>
-              <w:rPr>
-                <w:rFonts w:eastAsia="Arial" w:cs="Arial"/>
-                <w:color w:val="000000"/>
-                <w:sz w:val="22"/>
-                <w:szCs w:val="22"/>
-                <w:lang w:eastAsia="fr-FR"/>
-              </w:rPr>
-              <w:t xml:space="preserve"> de rappel automatique si le client ne répond pas (J+2, J+3, J+7, max 2).</w:t>
+              <w:t>Email de rappel automatique si le client ne répond pas (J+2, J+3, J+7, max 2).</w:t>
             </w:r>
           </w:p>
         </w:tc>
       </w:tr>
       <w:tr>
-        <w:tblPrEx>
-          <w:tblCellMar>
-            <w:top w:w="0" w:type="dxa"/>
-            <w:bottom w:w="0" w:type="dxa"/>
-          </w:tblCellMar>
-        </w:tblPrEx>
         <w:trPr>
           <w:trHeight w:val="537"/>
           <w:jc w:val="center"/>
@@ -7125,12 +5918,6 @@
         </w:tc>
       </w:tr>
       <w:tr>
-        <w:tblPrEx>
-          <w:tblCellMar>
-            <w:top w:w="0" w:type="dxa"/>
-            <w:bottom w:w="0" w:type="dxa"/>
-          </w:tblCellMar>
-        </w:tblPrEx>
         <w:trPr>
           <w:trHeight w:val="538"/>
           <w:jc w:val="center"/>
@@ -7214,25 +6001,7 @@
         <w:rPr>
           <w:lang w:eastAsia="fr-FR"/>
         </w:rPr>
-        <w:t>N</w:t>
-      </w:r>
-      <w:r>
-        <w:rPr>
-          <w:lang w:eastAsia="fr-FR"/>
-        </w:rPr>
-        <w:t>e jamais dire : « l’IA calcule le prix »</w:t>
-      </w:r>
-      <w:r>
-        <w:rPr>
-          <w:lang w:eastAsia="fr-FR"/>
-        </w:rPr>
-        <w:t xml:space="preserve">, </w:t>
-      </w:r>
-      <w:r>
-        <w:rPr>
-          <w:lang w:eastAsia="fr-FR"/>
-        </w:rPr>
-        <w:t>l’agent collecte les informations et appelle le moteur qui calcule le prix de manière déterministe.</w:t>
+        <w:t>Ne jamais dire : « l’IA calcule le prix », l’agent collecte les informations et appelle le moteur qui calcule le prix de manière déterministe.</w:t>
       </w:r>
     </w:p>
     <w:p>
@@ -7243,7 +6012,7 @@
         </w:rPr>
       </w:pPr>
       <w:bookmarkStart w:id="20" w:name="_Toc233658152"/>
-      <w:bookmarkStart w:id="21" w:name="_Toc233659545"/>
+      <w:bookmarkStart w:id="21" w:name="_Toc233660845"/>
       <w:r>
         <w:rPr>
           <w:lang w:eastAsia="fr-FR"/>
@@ -7279,21 +6048,7 @@
         <w:rPr>
           <w:lang w:eastAsia="fr-FR"/>
         </w:rPr>
-        <w:t xml:space="preserve"> (compte admin) → arrivée sur le </w:t>
-      </w:r>
-      <w:proofErr w:type="spellStart"/>
-      <w:r>
-        <w:rPr>
-          <w:lang w:eastAsia="fr-FR"/>
-        </w:rPr>
-        <w:t>dashboard</w:t>
-      </w:r>
-      <w:proofErr w:type="spellEnd"/>
-      <w:r>
-        <w:rPr>
-          <w:lang w:eastAsia="fr-FR"/>
-        </w:rPr>
-        <w:t xml:space="preserve"> </w:t>
+        <w:t xml:space="preserve"> (compte admin) → arrivée sur le dashboard </w:t>
       </w:r>
       <w:r>
         <w:rPr>
@@ -7322,21 +6077,7 @@
         <w:rPr>
           <w:lang w:eastAsia="fr-FR"/>
         </w:rPr>
-        <w:t xml:space="preserve">Le tableau ci-dessous regroupe les actions les plus courantes et la manière de les réaliser depuis le </w:t>
-      </w:r>
-      <w:proofErr w:type="spellStart"/>
-      <w:r>
-        <w:rPr>
-          <w:lang w:eastAsia="fr-FR"/>
-        </w:rPr>
-        <w:t>dashboard</w:t>
-      </w:r>
-      <w:proofErr w:type="spellEnd"/>
-      <w:r>
-        <w:rPr>
-          <w:lang w:eastAsia="fr-FR"/>
-        </w:rPr>
-        <w:t>.</w:t>
+        <w:t>Le tableau ci-dessous regroupe les actions les plus courantes et la manière de les réaliser depuis le dashboard.</w:t>
       </w:r>
     </w:p>
     <w:tbl>
@@ -7362,12 +6103,6 @@
         <w:gridCol w:w="6360"/>
       </w:tblGrid>
       <w:tr>
-        <w:tblPrEx>
-          <w:tblCellMar>
-            <w:top w:w="0" w:type="dxa"/>
-            <w:bottom w:w="0" w:type="dxa"/>
-          </w:tblCellMar>
-        </w:tblPrEx>
         <w:trPr>
           <w:tblHeader/>
           <w:jc w:val="center"/>
@@ -7445,12 +6180,6 @@
         </w:tc>
       </w:tr>
       <w:tr>
-        <w:tblPrEx>
-          <w:tblCellMar>
-            <w:top w:w="0" w:type="dxa"/>
-            <w:bottom w:w="0" w:type="dxa"/>
-          </w:tblCellMar>
-        </w:tblPrEx>
         <w:trPr>
           <w:trHeight w:val="506"/>
           <w:jc w:val="center"/>
@@ -7523,12 +6252,6 @@
         </w:tc>
       </w:tr>
       <w:tr>
-        <w:tblPrEx>
-          <w:tblCellMar>
-            <w:top w:w="0" w:type="dxa"/>
-            <w:bottom w:w="0" w:type="dxa"/>
-          </w:tblCellMar>
-        </w:tblPrEx>
         <w:trPr>
           <w:trHeight w:val="506"/>
           <w:jc w:val="center"/>
@@ -7601,12 +6324,6 @@
         </w:tc>
       </w:tr>
       <w:tr>
-        <w:tblPrEx>
-          <w:tblCellMar>
-            <w:top w:w="0" w:type="dxa"/>
-            <w:bottom w:w="0" w:type="dxa"/>
-          </w:tblCellMar>
-        </w:tblPrEx>
         <w:trPr>
           <w:trHeight w:val="506"/>
           <w:jc w:val="center"/>
@@ -7679,12 +6396,6 @@
         </w:tc>
       </w:tr>
       <w:tr>
-        <w:tblPrEx>
-          <w:tblCellMar>
-            <w:top w:w="0" w:type="dxa"/>
-            <w:bottom w:w="0" w:type="dxa"/>
-          </w:tblCellMar>
-        </w:tblPrEx>
         <w:trPr>
           <w:trHeight w:val="506"/>
           <w:jc w:val="center"/>
@@ -7757,12 +6468,6 @@
         </w:tc>
       </w:tr>
       <w:tr>
-        <w:tblPrEx>
-          <w:tblCellMar>
-            <w:top w:w="0" w:type="dxa"/>
-            <w:bottom w:w="0" w:type="dxa"/>
-          </w:tblCellMar>
-        </w:tblPrEx>
         <w:trPr>
           <w:trHeight w:val="506"/>
           <w:jc w:val="center"/>
@@ -7835,12 +6540,6 @@
         </w:tc>
       </w:tr>
       <w:tr>
-        <w:tblPrEx>
-          <w:tblCellMar>
-            <w:top w:w="0" w:type="dxa"/>
-            <w:bottom w:w="0" w:type="dxa"/>
-          </w:tblCellMar>
-        </w:tblPrEx>
         <w:trPr>
           <w:trHeight w:val="506"/>
           <w:jc w:val="center"/>
@@ -7913,12 +6612,6 @@
         </w:tc>
       </w:tr>
       <w:tr>
-        <w:tblPrEx>
-          <w:tblCellMar>
-            <w:top w:w="0" w:type="dxa"/>
-            <w:bottom w:w="0" w:type="dxa"/>
-          </w:tblCellMar>
-        </w:tblPrEx>
         <w:trPr>
           <w:trHeight w:val="506"/>
           <w:jc w:val="center"/>
@@ -7991,12 +6684,6 @@
         </w:tc>
       </w:tr>
       <w:tr>
-        <w:tblPrEx>
-          <w:tblCellMar>
-            <w:top w:w="0" w:type="dxa"/>
-            <w:bottom w:w="0" w:type="dxa"/>
-          </w:tblCellMar>
-        </w:tblPrEx>
         <w:trPr>
           <w:trHeight w:val="506"/>
           <w:jc w:val="center"/>
@@ -8077,7 +6764,7 @@
         </w:rPr>
       </w:pPr>
       <w:bookmarkStart w:id="22" w:name="_Toc233658153"/>
-      <w:bookmarkStart w:id="23" w:name="_Toc233659546"/>
+      <w:bookmarkStart w:id="23" w:name="_Toc233660846"/>
       <w:r>
         <w:rPr>
           <w:lang w:eastAsia="fr-FR"/>
@@ -8124,12 +6811,6 @@
         <w:gridCol w:w="6360"/>
       </w:tblGrid>
       <w:tr>
-        <w:tblPrEx>
-          <w:tblCellMar>
-            <w:top w:w="0" w:type="dxa"/>
-            <w:bottom w:w="0" w:type="dxa"/>
-          </w:tblCellMar>
-        </w:tblPrEx>
         <w:trPr>
           <w:tblHeader/>
           <w:jc w:val="center"/>
@@ -8206,12 +6887,6 @@
         </w:tc>
       </w:tr>
       <w:tr>
-        <w:tblPrEx>
-          <w:tblCellMar>
-            <w:top w:w="0" w:type="dxa"/>
-            <w:bottom w:w="0" w:type="dxa"/>
-          </w:tblCellMar>
-        </w:tblPrEx>
         <w:trPr>
           <w:trHeight w:val="454"/>
           <w:jc w:val="center"/>
@@ -8284,12 +6959,6 @@
         </w:tc>
       </w:tr>
       <w:tr>
-        <w:tblPrEx>
-          <w:tblCellMar>
-            <w:top w:w="0" w:type="dxa"/>
-            <w:bottom w:w="0" w:type="dxa"/>
-          </w:tblCellMar>
-        </w:tblPrEx>
         <w:trPr>
           <w:trHeight w:val="454"/>
           <w:jc w:val="center"/>
@@ -8362,12 +7031,6 @@
         </w:tc>
       </w:tr>
       <w:tr>
-        <w:tblPrEx>
-          <w:tblCellMar>
-            <w:top w:w="0" w:type="dxa"/>
-            <w:bottom w:w="0" w:type="dxa"/>
-          </w:tblCellMar>
-        </w:tblPrEx>
         <w:trPr>
           <w:trHeight w:val="454"/>
           <w:jc w:val="center"/>
@@ -8440,12 +7103,6 @@
         </w:tc>
       </w:tr>
       <w:tr>
-        <w:tblPrEx>
-          <w:tblCellMar>
-            <w:top w:w="0" w:type="dxa"/>
-            <w:bottom w:w="0" w:type="dxa"/>
-          </w:tblCellMar>
-        </w:tblPrEx>
         <w:trPr>
           <w:trHeight w:val="454"/>
           <w:jc w:val="center"/>
@@ -8518,12 +7175,6 @@
         </w:tc>
       </w:tr>
       <w:tr>
-        <w:tblPrEx>
-          <w:tblCellMar>
-            <w:top w:w="0" w:type="dxa"/>
-            <w:bottom w:w="0" w:type="dxa"/>
-          </w:tblCellMar>
-        </w:tblPrEx>
         <w:trPr>
           <w:trHeight w:val="454"/>
           <w:jc w:val="center"/>
@@ -8596,12 +7247,6 @@
         </w:tc>
       </w:tr>
       <w:tr>
-        <w:tblPrEx>
-          <w:tblCellMar>
-            <w:top w:w="0" w:type="dxa"/>
-            <w:bottom w:w="0" w:type="dxa"/>
-          </w:tblCellMar>
-        </w:tblPrEx>
         <w:trPr>
           <w:trHeight w:val="454"/>
           <w:jc w:val="center"/>
@@ -8674,12 +7319,6 @@
         </w:tc>
       </w:tr>
       <w:tr>
-        <w:tblPrEx>
-          <w:tblCellMar>
-            <w:top w:w="0" w:type="dxa"/>
-            <w:bottom w:w="0" w:type="dxa"/>
-          </w:tblCellMar>
-        </w:tblPrEx>
         <w:trPr>
           <w:trHeight w:val="454"/>
           <w:jc w:val="center"/>
@@ -8780,41 +7419,13 @@
         </w:rPr>
       </w:pPr>
       <w:bookmarkStart w:id="24" w:name="_Toc233658154"/>
-      <w:bookmarkStart w:id="25" w:name="_Toc233659547"/>
+      <w:bookmarkStart w:id="25" w:name="_Toc233660847"/>
       <w:r>
         <w:rPr>
           <w:lang w:eastAsia="fr-FR"/>
         </w:rPr>
         <w:lastRenderedPageBreak/>
-        <w:t xml:space="preserve">Partie C — Comment modifier </w:t>
-      </w:r>
-      <w:proofErr w:type="spellStart"/>
-      <w:r>
-        <w:rPr>
-          <w:lang w:eastAsia="fr-FR"/>
-        </w:rPr>
-        <w:t>pricing</w:t>
-      </w:r>
-      <w:proofErr w:type="spellEnd"/>
-      <w:r>
-        <w:rPr>
-          <w:lang w:eastAsia="fr-FR"/>
-        </w:rPr>
-        <w:t xml:space="preserve">, </w:t>
-      </w:r>
-      <w:proofErr w:type="gramStart"/>
-      <w:r>
-        <w:rPr>
-          <w:lang w:eastAsia="fr-FR"/>
-        </w:rPr>
-        <w:t>emails</w:t>
-      </w:r>
-      <w:proofErr w:type="gramEnd"/>
-      <w:r>
-        <w:rPr>
-          <w:lang w:eastAsia="fr-FR"/>
-        </w:rPr>
-        <w:t>, statuts, relances</w:t>
+        <w:t>Partie C — Comment modifier pricing, emails, statuts, relances</w:t>
       </w:r>
       <w:bookmarkEnd w:id="24"/>
       <w:bookmarkEnd w:id="25"/>
@@ -8830,21 +7441,7 @@
         <w:rPr>
           <w:lang w:eastAsia="fr-FR"/>
         </w:rPr>
-        <w:t xml:space="preserve">Antisèche destinée au développeur qui maintient l’outil. Règle générale : modifier la logique pure (web/lib/ ou </w:t>
-      </w:r>
-      <w:proofErr w:type="spellStart"/>
-      <w:r>
-        <w:rPr>
-          <w:lang w:eastAsia="fr-FR"/>
-        </w:rPr>
-        <w:t>pricing</w:t>
-      </w:r>
-      <w:proofErr w:type="spellEnd"/>
-      <w:r>
-        <w:rPr>
-          <w:lang w:eastAsia="fr-FR"/>
-        </w:rPr>
-        <w:t>/), relancer les tests, puis reporter dans n8n si nécessaire.</w:t>
+        <w:t>Antisèche destinée au développeur qui maintient l’outil. Règle générale : modifier la logique pure (web/lib/ ou pricing/), relancer les tests, puis reporter dans n8n si nécessaire.</w:t>
       </w:r>
     </w:p>
     <w:p>
@@ -8855,23 +7452,15 @@
         </w:rPr>
       </w:pPr>
       <w:bookmarkStart w:id="26" w:name="_Toc233658155"/>
-      <w:bookmarkStart w:id="27" w:name="_Toc233659548"/>
-      <w:r>
-        <w:rPr>
-          <w:lang w:eastAsia="fr-FR"/>
-        </w:rPr>
-        <w:t xml:space="preserve">Modifier le </w:t>
-      </w:r>
-      <w:proofErr w:type="spellStart"/>
-      <w:r>
-        <w:rPr>
-          <w:lang w:eastAsia="fr-FR"/>
-        </w:rPr>
-        <w:t>pricing</w:t>
+      <w:bookmarkStart w:id="27" w:name="_Toc233660848"/>
+      <w:r>
+        <w:rPr>
+          <w:lang w:eastAsia="fr-FR"/>
+        </w:rPr>
+        <w:t>Modifier le pricing</w:t>
       </w:r>
       <w:bookmarkEnd w:id="26"/>
       <w:bookmarkEnd w:id="27"/>
-      <w:proofErr w:type="spellEnd"/>
     </w:p>
     <w:p>
       <w:pPr>
@@ -8889,35 +7478,7 @@
         <w:rPr>
           <w:lang w:eastAsia="fr-FR"/>
         </w:rPr>
-        <w:t xml:space="preserve">Tarifs / TVA / marge / coefficients : </w:t>
-      </w:r>
-      <w:proofErr w:type="spellStart"/>
-      <w:r>
-        <w:rPr>
-          <w:lang w:eastAsia="fr-FR"/>
-        </w:rPr>
-        <w:t>pricing</w:t>
-      </w:r>
-      <w:proofErr w:type="spellEnd"/>
-      <w:r>
-        <w:rPr>
-          <w:lang w:eastAsia="fr-FR"/>
-        </w:rPr>
-        <w:t xml:space="preserve">/matrices.js (source de vérité) + table </w:t>
-      </w:r>
-      <w:proofErr w:type="spellStart"/>
-      <w:r>
-        <w:rPr>
-          <w:lang w:eastAsia="fr-FR"/>
-        </w:rPr>
-        <w:t>pricing_config</w:t>
-      </w:r>
-      <w:proofErr w:type="spellEnd"/>
-      <w:r>
-        <w:rPr>
-          <w:lang w:eastAsia="fr-FR"/>
-        </w:rPr>
-        <w:t xml:space="preserve"> en base</w:t>
+        <w:t>Tarifs / TVA / marge / coefficients : pricing/matrices.js (source de vérité) + table pricing_config en base</w:t>
       </w:r>
     </w:p>
     <w:p>
@@ -8936,35 +7497,7 @@
         <w:rPr>
           <w:lang w:eastAsia="fr-FR"/>
         </w:rPr>
-        <w:t>Reporter la même valeur dans le miroir TS web/lib/</w:t>
-      </w:r>
-      <w:proofErr w:type="spellStart"/>
-      <w:r>
-        <w:rPr>
-          <w:lang w:eastAsia="fr-FR"/>
-        </w:rPr>
-        <w:t>calculerDevis.ts</w:t>
-      </w:r>
-      <w:proofErr w:type="spellEnd"/>
-      <w:r>
-        <w:rPr>
-          <w:lang w:eastAsia="fr-FR"/>
-        </w:rPr>
-        <w:t xml:space="preserve"> ET dans le nœud Code n8n (</w:t>
-      </w:r>
-      <w:proofErr w:type="spellStart"/>
-      <w:r>
-        <w:rPr>
-          <w:lang w:eastAsia="fr-FR"/>
-        </w:rPr>
-        <w:t>pricing</w:t>
-      </w:r>
-      <w:proofErr w:type="spellEnd"/>
-      <w:r>
-        <w:rPr>
-          <w:lang w:eastAsia="fr-FR"/>
-        </w:rPr>
-        <w:t>/n8n-code-node.js)</w:t>
+        <w:t>Reporter la même valeur dans le miroir TS web/lib/calculerDevis.ts ET dans le nœud Code n8n (pricing/n8n-code-node.js)</w:t>
       </w:r>
     </w:p>
     <w:p>
@@ -8983,21 +7516,7 @@
         <w:rPr>
           <w:lang w:eastAsia="fr-FR"/>
         </w:rPr>
-        <w:t xml:space="preserve">Seuil d’escalade (85 pax) : </w:t>
-      </w:r>
-      <w:proofErr w:type="spellStart"/>
-      <w:r>
-        <w:rPr>
-          <w:lang w:eastAsia="fr-FR"/>
-        </w:rPr>
-        <w:t>seuil_escalade_passagers</w:t>
-      </w:r>
-      <w:proofErr w:type="spellEnd"/>
-      <w:r>
-        <w:rPr>
-          <w:lang w:eastAsia="fr-FR"/>
-        </w:rPr>
-        <w:t xml:space="preserve"> dans les matrices</w:t>
+        <w:t>Seuil d’escalade (85 pax) : seuil_escalade_passagers dans les matrices</w:t>
       </w:r>
     </w:p>
     <w:p>
@@ -9016,21 +7535,7 @@
         <w:rPr>
           <w:lang w:eastAsia="fr-FR"/>
         </w:rPr>
-        <w:t xml:space="preserve">Toujours relancer </w:t>
-      </w:r>
-      <w:proofErr w:type="spellStart"/>
-      <w:r>
-        <w:rPr>
-          <w:lang w:eastAsia="fr-FR"/>
-        </w:rPr>
-        <w:t>npm</w:t>
-      </w:r>
-      <w:proofErr w:type="spellEnd"/>
-      <w:r>
-        <w:rPr>
-          <w:lang w:eastAsia="fr-FR"/>
-        </w:rPr>
-        <w:t xml:space="preserve"> test après modification (anti-régression)</w:t>
+        <w:t>Toujours relancer npm test après modification (anti-régression)</w:t>
       </w:r>
     </w:p>
     <w:p>
@@ -9063,23 +7568,15 @@
         </w:rPr>
       </w:pPr>
       <w:bookmarkStart w:id="28" w:name="_Toc233658156"/>
-      <w:bookmarkStart w:id="29" w:name="_Toc233659549"/>
-      <w:r>
-        <w:rPr>
-          <w:lang w:eastAsia="fr-FR"/>
-        </w:rPr>
-        <w:t xml:space="preserve">Modifier les </w:t>
-      </w:r>
-      <w:proofErr w:type="gramStart"/>
-      <w:r>
-        <w:rPr>
-          <w:lang w:eastAsia="fr-FR"/>
-        </w:rPr>
-        <w:t>emails</w:t>
+      <w:bookmarkStart w:id="29" w:name="_Toc233660849"/>
+      <w:r>
+        <w:rPr>
+          <w:lang w:eastAsia="fr-FR"/>
+        </w:rPr>
+        <w:t>Modifier les emails</w:t>
       </w:r>
       <w:bookmarkEnd w:id="28"/>
       <w:bookmarkEnd w:id="29"/>
-      <w:proofErr w:type="gramEnd"/>
     </w:p>
     <w:p>
       <w:pPr>
@@ -9097,30 +7594,8 @@
         <w:rPr>
           <w:lang w:eastAsia="fr-FR"/>
         </w:rPr>
-        <w:t xml:space="preserve">Contenu / gabarit </w:t>
-      </w:r>
-      <w:proofErr w:type="gramStart"/>
-      <w:r>
-        <w:rPr>
-          <w:lang w:eastAsia="fr-FR"/>
-        </w:rPr>
-        <w:t>de l’email</w:t>
-      </w:r>
-      <w:proofErr w:type="gramEnd"/>
-      <w:r>
-        <w:rPr>
-          <w:lang w:eastAsia="fr-FR"/>
-        </w:rPr>
-        <w:t xml:space="preserve"> de devis : web/lib/</w:t>
-      </w:r>
-      <w:proofErr w:type="spellStart"/>
-      <w:r>
-        <w:rPr>
-          <w:lang w:eastAsia="fr-FR"/>
-        </w:rPr>
-        <w:t>emailDevis.ts</w:t>
-      </w:r>
-      <w:proofErr w:type="spellEnd"/>
+        <w:t>Contenu / gabarit de l’email de devis : web/lib/emailDevis.ts</w:t>
+      </w:r>
     </w:p>
     <w:p>
       <w:pPr>
@@ -9138,16 +7613,8 @@
         <w:rPr>
           <w:lang w:eastAsia="fr-FR"/>
         </w:rPr>
-        <w:t>PDF joint (logo, mentions, totaux) : web/lib/</w:t>
-      </w:r>
-      <w:proofErr w:type="spellStart"/>
-      <w:r>
-        <w:rPr>
-          <w:lang w:eastAsia="fr-FR"/>
-        </w:rPr>
-        <w:t>devisPdf.ts</w:t>
-      </w:r>
-      <w:proofErr w:type="spellEnd"/>
+        <w:t>PDF joint (logo, mentions, totaux) : web/lib/devisPdf.ts</w:t>
+      </w:r>
     </w:p>
     <w:p>
       <w:pPr>
@@ -9165,35 +7632,7 @@
         <w:rPr>
           <w:lang w:eastAsia="fr-FR"/>
         </w:rPr>
-        <w:t xml:space="preserve">Expéditeur : variable </w:t>
-      </w:r>
-      <w:proofErr w:type="gramStart"/>
-      <w:r>
-        <w:rPr>
-          <w:lang w:eastAsia="fr-FR"/>
-        </w:rPr>
-        <w:t>EMAIL</w:t>
-      </w:r>
-      <w:proofErr w:type="gramEnd"/>
-      <w:r>
-        <w:rPr>
-          <w:lang w:eastAsia="fr-FR"/>
-        </w:rPr>
-        <w:t xml:space="preserve">_FROM (doit appartenir au domaine vérifié sur </w:t>
-      </w:r>
-      <w:proofErr w:type="spellStart"/>
-      <w:r>
-        <w:rPr>
-          <w:lang w:eastAsia="fr-FR"/>
-        </w:rPr>
-        <w:t>Resend</w:t>
-      </w:r>
-      <w:proofErr w:type="spellEnd"/>
-      <w:r>
-        <w:rPr>
-          <w:lang w:eastAsia="fr-FR"/>
-        </w:rPr>
-        <w:t>)</w:t>
+        <w:t>Expéditeur : variable EMAIL_FROM (doit appartenir au domaine vérifié sur Resend)</w:t>
       </w:r>
     </w:p>
     <w:p>
@@ -9212,35 +7651,7 @@
         <w:rPr>
           <w:lang w:eastAsia="fr-FR"/>
         </w:rPr>
-        <w:t xml:space="preserve">Domaines « démo » sans envoi réel : variable </w:t>
-      </w:r>
-      <w:proofErr w:type="gramStart"/>
-      <w:r>
-        <w:rPr>
-          <w:lang w:eastAsia="fr-FR"/>
-        </w:rPr>
-        <w:t>EMAIL</w:t>
-      </w:r>
-      <w:proofErr w:type="gramEnd"/>
-      <w:r>
-        <w:rPr>
-          <w:lang w:eastAsia="fr-FR"/>
-        </w:rPr>
-        <w:t>_DEMO_DOMAINS (garde-fou web/lib/</w:t>
-      </w:r>
-      <w:proofErr w:type="spellStart"/>
-      <w:r>
-        <w:rPr>
-          <w:lang w:eastAsia="fr-FR"/>
-        </w:rPr>
-        <w:t>emailGuard.ts</w:t>
-      </w:r>
-      <w:proofErr w:type="spellEnd"/>
-      <w:r>
-        <w:rPr>
-          <w:lang w:eastAsia="fr-FR"/>
-        </w:rPr>
-        <w:t>)</w:t>
+        <w:t>Domaines « démo » sans envoi réel : variable EMAIL_DEMO_DOMAINS (garde-fou web/lib/emailGuard.ts)</w:t>
       </w:r>
     </w:p>
     <w:p>
@@ -9251,7 +7662,7 @@
         </w:rPr>
       </w:pPr>
       <w:bookmarkStart w:id="30" w:name="_Toc233658157"/>
-      <w:bookmarkStart w:id="31" w:name="_Toc233659550"/>
+      <w:bookmarkStart w:id="31" w:name="_Toc233660850"/>
       <w:r>
         <w:rPr>
           <w:lang w:eastAsia="fr-FR"/>
@@ -9277,49 +7688,7 @@
         <w:rPr>
           <w:lang w:eastAsia="fr-FR"/>
         </w:rPr>
-        <w:t xml:space="preserve">Cycle de vie d’une demande : </w:t>
-      </w:r>
-      <w:proofErr w:type="spellStart"/>
-      <w:r>
-        <w:rPr>
-          <w:lang w:eastAsia="fr-FR"/>
-        </w:rPr>
-        <w:t>enums</w:t>
-      </w:r>
-      <w:proofErr w:type="spellEnd"/>
-      <w:r>
-        <w:rPr>
-          <w:lang w:eastAsia="fr-FR"/>
-        </w:rPr>
-        <w:t xml:space="preserve"> dans </w:t>
-      </w:r>
-      <w:proofErr w:type="spellStart"/>
-      <w:r>
-        <w:rPr>
-          <w:lang w:eastAsia="fr-FR"/>
-        </w:rPr>
-        <w:t>supabase</w:t>
-      </w:r>
-      <w:proofErr w:type="spellEnd"/>
-      <w:r>
-        <w:rPr>
-          <w:lang w:eastAsia="fr-FR"/>
-        </w:rPr>
-        <w:t>/</w:t>
-      </w:r>
-      <w:proofErr w:type="spellStart"/>
-      <w:r>
-        <w:rPr>
-          <w:lang w:eastAsia="fr-FR"/>
-        </w:rPr>
-        <w:t>schema.sql</w:t>
-      </w:r>
-      <w:proofErr w:type="spellEnd"/>
-      <w:r>
-        <w:rPr>
-          <w:lang w:eastAsia="fr-FR"/>
-        </w:rPr>
-        <w:t xml:space="preserve"> (et le code qui les fait évoluer dans web/app/api/*)</w:t>
+        <w:t>Cycle de vie d’une demande : enums dans supabase/schema.sql (et le code qui les fait évoluer dans web/app/api/*)</w:t>
       </w:r>
     </w:p>
     <w:p>
@@ -9338,21 +7707,7 @@
         <w:rPr>
           <w:lang w:eastAsia="fr-FR"/>
         </w:rPr>
-        <w:t>Transitions : routes demande-statut, devis-</w:t>
-      </w:r>
-      <w:proofErr w:type="spellStart"/>
-      <w:r>
-        <w:rPr>
-          <w:lang w:eastAsia="fr-FR"/>
-        </w:rPr>
-        <w:t>reponse</w:t>
-      </w:r>
-      <w:proofErr w:type="spellEnd"/>
-      <w:r>
-        <w:rPr>
-          <w:lang w:eastAsia="fr-FR"/>
-        </w:rPr>
-        <w:t>, devis-manuel</w:t>
+        <w:t>Transitions : routes demande-statut, devis-reponse, devis-manuel</w:t>
       </w:r>
     </w:p>
     <w:p>
@@ -9382,7 +7737,7 @@
         </w:rPr>
       </w:pPr>
       <w:bookmarkStart w:id="32" w:name="_Toc233658158"/>
-      <w:bookmarkStart w:id="33" w:name="_Toc233659551"/>
+      <w:bookmarkStart w:id="33" w:name="_Toc233660851"/>
       <w:r>
         <w:rPr>
           <w:lang w:eastAsia="fr-FR"/>
@@ -9407,21 +7762,7 @@
         <w:rPr>
           <w:lang w:eastAsia="fr-FR"/>
         </w:rPr>
-        <w:t>Cadence (J+2 / J+3 / J+7), nombre max, expiration : web/lib/</w:t>
-      </w:r>
-      <w:proofErr w:type="spellStart"/>
-      <w:r>
-        <w:rPr>
-          <w:lang w:eastAsia="fr-FR"/>
-        </w:rPr>
-        <w:t>relances.ts</w:t>
-      </w:r>
-      <w:proofErr w:type="spellEnd"/>
-      <w:r>
-        <w:rPr>
-          <w:lang w:eastAsia="fr-FR"/>
-        </w:rPr>
-        <w:t xml:space="preserve"> (logique pure, testée)</w:t>
+        <w:t>Cadence (J+2 / J+3 / J+7), nombre max, expiration : web/lib/relances.ts (logique pure, testée)</w:t>
       </w:r>
     </w:p>
     <w:p>
@@ -9439,23 +7780,7 @@
         <w:rPr>
           <w:lang w:eastAsia="fr-FR"/>
         </w:rPr>
-        <w:t>Déclenchement planifié : workflow n8n relances-</w:t>
-      </w:r>
-      <w:proofErr w:type="spellStart"/>
-      <w:proofErr w:type="gramStart"/>
-      <w:r>
-        <w:rPr>
-          <w:lang w:eastAsia="fr-FR"/>
-        </w:rPr>
-        <w:t>workflow.json</w:t>
-      </w:r>
-      <w:proofErr w:type="spellEnd"/>
-      <w:proofErr w:type="gramEnd"/>
-      <w:r>
-        <w:rPr>
-          <w:lang w:eastAsia="fr-FR"/>
-        </w:rPr>
-        <w:t xml:space="preserve"> (fréquence du Schedule Trigger)</w:t>
+        <w:t>Déclenchement planifié : workflow n8n relances-workflow.json (fréquence du Schedule Trigger)</w:t>
       </w:r>
     </w:p>
     <w:p>
@@ -9473,21 +7798,7 @@
         <w:rPr>
           <w:lang w:eastAsia="fr-FR"/>
         </w:rPr>
-        <w:t>Exécution : web/app/api/relances/</w:t>
-      </w:r>
-      <w:proofErr w:type="spellStart"/>
-      <w:r>
-        <w:rPr>
-          <w:lang w:eastAsia="fr-FR"/>
-        </w:rPr>
-        <w:t>route.ts</w:t>
-      </w:r>
-      <w:proofErr w:type="spellEnd"/>
-      <w:r>
-        <w:rPr>
-          <w:lang w:eastAsia="fr-FR"/>
-        </w:rPr>
-        <w:t xml:space="preserve"> (protégée par CRON_SECRET)</w:t>
+        <w:t>Exécution : web/app/api/relances/route.ts (protégée par CRON_SECRET)</w:t>
       </w:r>
     </w:p>
     <w:p>
@@ -9518,27 +7829,13 @@
         </w:rPr>
       </w:pPr>
       <w:bookmarkStart w:id="34" w:name="_Toc233658159"/>
-      <w:bookmarkStart w:id="35" w:name="_Toc233659552"/>
+      <w:bookmarkStart w:id="35" w:name="_Toc233660852"/>
       <w:r>
         <w:rPr>
           <w:lang w:eastAsia="fr-FR"/>
         </w:rPr>
         <w:lastRenderedPageBreak/>
-        <w:t xml:space="preserve">Partie D — </w:t>
-      </w:r>
-      <w:proofErr w:type="spellStart"/>
-      <w:r>
-        <w:rPr>
-          <w:lang w:eastAsia="fr-FR"/>
-        </w:rPr>
-        <w:t>Backlog</w:t>
-      </w:r>
-      <w:proofErr w:type="spellEnd"/>
-      <w:r>
-        <w:rPr>
-          <w:lang w:eastAsia="fr-FR"/>
-        </w:rPr>
-        <w:t xml:space="preserve"> P1/P2/P3 &amp; prochaines évolutions</w:t>
+        <w:t>Partie D — Backlog P1/P2/P3 &amp; prochaines évolutions</w:t>
       </w:r>
       <w:bookmarkEnd w:id="34"/>
       <w:bookmarkEnd w:id="35"/>
@@ -9551,12 +7848,12 @@
         </w:rPr>
       </w:pPr>
       <w:bookmarkStart w:id="36" w:name="_Toc233658160"/>
-      <w:bookmarkStart w:id="37" w:name="_Toc233659553"/>
-      <w:r>
-        <w:rPr>
-          <w:lang w:eastAsia="fr-FR"/>
-        </w:rPr>
-        <w:t>D.1 État livré (MVP)</w:t>
+      <w:bookmarkStart w:id="37" w:name="_Toc233660853"/>
+      <w:r>
+        <w:rPr>
+          <w:lang w:eastAsia="fr-FR"/>
+        </w:rPr>
+        <w:t>État livré (MVP)</w:t>
       </w:r>
       <w:bookmarkEnd w:id="36"/>
       <w:bookmarkEnd w:id="37"/>
@@ -9572,35 +7869,7 @@
         <w:rPr>
           <w:lang w:eastAsia="fr-FR"/>
         </w:rPr>
-        <w:t xml:space="preserve">Sont livrés et fonctionnels : moteur de devis testé, agent de qualification, devis PDF + </w:t>
-      </w:r>
-      <w:proofErr w:type="gramStart"/>
-      <w:r>
-        <w:rPr>
-          <w:lang w:eastAsia="fr-FR"/>
-        </w:rPr>
-        <w:t>email</w:t>
-      </w:r>
-      <w:proofErr w:type="gramEnd"/>
-      <w:r>
-        <w:rPr>
-          <w:lang w:eastAsia="fr-FR"/>
-        </w:rPr>
-        <w:t xml:space="preserve">, relances, escalade HITL, </w:t>
-      </w:r>
-      <w:proofErr w:type="spellStart"/>
-      <w:r>
-        <w:rPr>
-          <w:lang w:eastAsia="fr-FR"/>
-        </w:rPr>
-        <w:t>dashboard</w:t>
-      </w:r>
-      <w:proofErr w:type="spellEnd"/>
-      <w:r>
-        <w:rPr>
-          <w:lang w:eastAsia="fr-FR"/>
-        </w:rPr>
-        <w:t xml:space="preserve"> de pilotage, espace client, messagerie HITL.</w:t>
+        <w:t>Sont livrés et fonctionnels : moteur de devis testé, agent de qualification, devis PDF + email, relances, escalade HITL, dashboard de pilotage, espace client, messagerie HITL.</w:t>
       </w:r>
     </w:p>
     <w:p>
@@ -9611,26 +7880,12 @@
         </w:rPr>
       </w:pPr>
       <w:bookmarkStart w:id="38" w:name="_Toc233658161"/>
-      <w:bookmarkStart w:id="39" w:name="_Toc233659554"/>
-      <w:r>
-        <w:rPr>
-          <w:lang w:eastAsia="fr-FR"/>
-        </w:rPr>
-        <w:t xml:space="preserve">D.2 </w:t>
-      </w:r>
-      <w:proofErr w:type="spellStart"/>
-      <w:r>
-        <w:rPr>
-          <w:lang w:eastAsia="fr-FR"/>
-        </w:rPr>
-        <w:t>Backlog</w:t>
-      </w:r>
-      <w:proofErr w:type="spellEnd"/>
-      <w:r>
-        <w:rPr>
-          <w:lang w:eastAsia="fr-FR"/>
-        </w:rPr>
-        <w:t xml:space="preserve"> priorisé des évolutions</w:t>
+      <w:bookmarkStart w:id="39" w:name="_Toc233660854"/>
+      <w:r>
+        <w:rPr>
+          <w:lang w:eastAsia="fr-FR"/>
+        </w:rPr>
+        <w:t>Backlog priorisé des évolutions</w:t>
       </w:r>
       <w:bookmarkEnd w:id="38"/>
       <w:bookmarkEnd w:id="39"/>
@@ -9673,12 +7928,6 @@
         <w:gridCol w:w="3200"/>
       </w:tblGrid>
       <w:tr>
-        <w:tblPrEx>
-          <w:tblCellMar>
-            <w:top w:w="0" w:type="dxa"/>
-            <w:bottom w:w="0" w:type="dxa"/>
-          </w:tblCellMar>
-        </w:tblPrEx>
         <w:trPr>
           <w:tblHeader/>
           <w:jc w:val="center"/>
@@ -9790,12 +8039,6 @@
         </w:tc>
       </w:tr>
       <w:tr>
-        <w:tblPrEx>
-          <w:tblCellMar>
-            <w:top w:w="0" w:type="dxa"/>
-            <w:bottom w:w="0" w:type="dxa"/>
-          </w:tblCellMar>
-        </w:tblPrEx>
         <w:trPr>
           <w:trHeight w:val="506"/>
           <w:jc w:val="center"/>
@@ -9898,12 +8141,6 @@
         </w:tc>
       </w:tr>
       <w:tr>
-        <w:tblPrEx>
-          <w:tblCellMar>
-            <w:top w:w="0" w:type="dxa"/>
-            <w:bottom w:w="0" w:type="dxa"/>
-          </w:tblCellMar>
-        </w:tblPrEx>
         <w:trPr>
           <w:trHeight w:val="506"/>
           <w:jc w:val="center"/>
@@ -9968,27 +8205,7 @@
                 <w:szCs w:val="22"/>
                 <w:lang w:eastAsia="fr-FR"/>
               </w:rPr>
-              <w:t xml:space="preserve">Empêcher la mise en pause de </w:t>
-            </w:r>
-            <w:proofErr w:type="spellStart"/>
-            <w:r>
-              <w:rPr>
-                <w:rFonts w:eastAsia="Arial" w:cs="Arial"/>
-                <w:sz w:val="22"/>
-                <w:szCs w:val="22"/>
-                <w:lang w:eastAsia="fr-FR"/>
-              </w:rPr>
-              <w:t>Supabase</w:t>
-            </w:r>
-            <w:proofErr w:type="spellEnd"/>
-            <w:r>
-              <w:rPr>
-                <w:rFonts w:eastAsia="Arial" w:cs="Arial"/>
-                <w:sz w:val="22"/>
-                <w:szCs w:val="22"/>
-                <w:lang w:eastAsia="fr-FR"/>
-              </w:rPr>
-              <w:t xml:space="preserve"> (offre Pro)</w:t>
+              <w:t>Empêcher la mise en pause de Supabase (offre Pro)</w:t>
             </w:r>
           </w:p>
         </w:tc>
@@ -10026,12 +8243,6 @@
         </w:tc>
       </w:tr>
       <w:tr>
-        <w:tblPrEx>
-          <w:tblCellMar>
-            <w:top w:w="0" w:type="dxa"/>
-            <w:bottom w:w="0" w:type="dxa"/>
-          </w:tblCellMar>
-        </w:tblPrEx>
         <w:trPr>
           <w:trHeight w:val="506"/>
           <w:jc w:val="center"/>
@@ -10134,12 +8345,6 @@
         </w:tc>
       </w:tr>
       <w:tr>
-        <w:tblPrEx>
-          <w:tblCellMar>
-            <w:top w:w="0" w:type="dxa"/>
-            <w:bottom w:w="0" w:type="dxa"/>
-          </w:tblCellMar>
-        </w:tblPrEx>
         <w:trPr>
           <w:trHeight w:val="506"/>
           <w:jc w:val="center"/>
@@ -10204,39 +8409,8 @@
                 <w:szCs w:val="22"/>
                 <w:lang w:eastAsia="fr-FR"/>
               </w:rPr>
-              <w:t>Observabilité : coût/</w:t>
-            </w:r>
-            <w:proofErr w:type="spellStart"/>
-            <w:r>
-              <w:rPr>
-                <w:rFonts w:eastAsia="Arial" w:cs="Arial"/>
-                <w:sz w:val="22"/>
-                <w:szCs w:val="22"/>
-                <w:lang w:eastAsia="fr-FR"/>
-              </w:rPr>
-              <w:t>tokens</w:t>
-            </w:r>
-            <w:proofErr w:type="spellEnd"/>
-            <w:r>
-              <w:rPr>
-                <w:rFonts w:eastAsia="Arial" w:cs="Arial"/>
-                <w:sz w:val="22"/>
-                <w:szCs w:val="22"/>
-                <w:lang w:eastAsia="fr-FR"/>
-              </w:rPr>
-              <w:t xml:space="preserve"> par devis dans le </w:t>
-            </w:r>
-            <w:proofErr w:type="spellStart"/>
-            <w:r>
-              <w:rPr>
-                <w:rFonts w:eastAsia="Arial" w:cs="Arial"/>
-                <w:sz w:val="22"/>
-                <w:szCs w:val="22"/>
-                <w:lang w:eastAsia="fr-FR"/>
-              </w:rPr>
-              <w:t>dashboard</w:t>
-            </w:r>
-            <w:proofErr w:type="spellEnd"/>
+              <w:t>Observabilité : coût/tokens par devis dans le dashboard</w:t>
+            </w:r>
           </w:p>
         </w:tc>
         <w:tc>
@@ -10273,12 +8447,6 @@
         </w:tc>
       </w:tr>
       <w:tr>
-        <w:tblPrEx>
-          <w:tblCellMar>
-            <w:top w:w="0" w:type="dxa"/>
-            <w:bottom w:w="0" w:type="dxa"/>
-          </w:tblCellMar>
-        </w:tblPrEx>
         <w:trPr>
           <w:trHeight w:val="506"/>
           <w:jc w:val="center"/>
@@ -10381,12 +8549,6 @@
         </w:tc>
       </w:tr>
       <w:tr>
-        <w:tblPrEx>
-          <w:tblCellMar>
-            <w:top w:w="0" w:type="dxa"/>
-            <w:bottom w:w="0" w:type="dxa"/>
-          </w:tblCellMar>
-        </w:tblPrEx>
         <w:trPr>
           <w:trHeight w:val="506"/>
           <w:jc w:val="center"/>
@@ -10451,27 +8613,7 @@
                 <w:szCs w:val="22"/>
                 <w:lang w:eastAsia="fr-FR"/>
               </w:rPr>
-              <w:t xml:space="preserve">Canal WhatsApp officiel (en plus </w:t>
-            </w:r>
-            <w:proofErr w:type="gramStart"/>
-            <w:r>
-              <w:rPr>
-                <w:rFonts w:eastAsia="Arial" w:cs="Arial"/>
-                <w:sz w:val="22"/>
-                <w:szCs w:val="22"/>
-                <w:lang w:eastAsia="fr-FR"/>
-              </w:rPr>
-              <w:t>de l’email</w:t>
-            </w:r>
-            <w:proofErr w:type="gramEnd"/>
-            <w:r>
-              <w:rPr>
-                <w:rFonts w:eastAsia="Arial" w:cs="Arial"/>
-                <w:sz w:val="22"/>
-                <w:szCs w:val="22"/>
-                <w:lang w:eastAsia="fr-FR"/>
-              </w:rPr>
-              <w:t>)</w:t>
+              <w:t>Canal WhatsApp officiel (en plus de l’email)</w:t>
             </w:r>
           </w:p>
         </w:tc>
@@ -10509,12 +8651,6 @@
         </w:tc>
       </w:tr>
       <w:tr>
-        <w:tblPrEx>
-          <w:tblCellMar>
-            <w:top w:w="0" w:type="dxa"/>
-            <w:bottom w:w="0" w:type="dxa"/>
-          </w:tblCellMar>
-        </w:tblPrEx>
         <w:trPr>
           <w:trHeight w:val="506"/>
           <w:jc w:val="center"/>
@@ -10579,27 +8715,7 @@
                 <w:szCs w:val="22"/>
                 <w:lang w:eastAsia="fr-FR"/>
               </w:rPr>
-              <w:t xml:space="preserve">A/B </w:t>
-            </w:r>
-            <w:proofErr w:type="spellStart"/>
-            <w:r>
-              <w:rPr>
-                <w:rFonts w:eastAsia="Arial" w:cs="Arial"/>
-                <w:sz w:val="22"/>
-                <w:szCs w:val="22"/>
-                <w:lang w:eastAsia="fr-FR"/>
-              </w:rPr>
-              <w:t>testing</w:t>
-            </w:r>
-            <w:proofErr w:type="spellEnd"/>
-            <w:r>
-              <w:rPr>
-                <w:rFonts w:eastAsia="Arial" w:cs="Arial"/>
-                <w:sz w:val="22"/>
-                <w:szCs w:val="22"/>
-                <w:lang w:eastAsia="fr-FR"/>
-              </w:rPr>
-              <w:t xml:space="preserve"> des messages de relance</w:t>
+              <w:t>A/B testing des messages de relance</w:t>
             </w:r>
           </w:p>
         </w:tc>
@@ -10637,12 +8753,6 @@
         </w:tc>
       </w:tr>
       <w:tr>
-        <w:tblPrEx>
-          <w:tblCellMar>
-            <w:top w:w="0" w:type="dxa"/>
-            <w:bottom w:w="0" w:type="dxa"/>
-          </w:tblCellMar>
-        </w:tblPrEx>
         <w:trPr>
           <w:trHeight w:val="506"/>
           <w:jc w:val="center"/>
@@ -13918,19 +12028,17 @@
 </file>
 
 <file path=customXml/item1.xml><?xml version="1.0" encoding="utf-8"?>
-<?mso-contentType ?>
-<FormTemplates xmlns="http://schemas.microsoft.com/sharepoint/v3/contenttype/forms">
-  <Display>DocumentLibraryForm</Display>
-  <Edit>DocumentLibraryForm</Edit>
-  <New>DocumentLibraryForm</New>
-</FormTemplates>
+<p:properties xmlns:p="http://schemas.microsoft.com/office/2006/metadata/properties" xmlns:xsi="http://www.w3.org/2001/XMLSchema-instance" xmlns:pc="http://schemas.microsoft.com/office/infopath/2007/PartnerControls">
+  <documentManagement>
+    <lcf76f155ced4ddcb4097134ff3c332f xmlns="e92e7415-81cb-47b8-a844-76566823e5a2">
+      <Terms xmlns="http://schemas.microsoft.com/office/infopath/2007/PartnerControls"/>
+    </lcf76f155ced4ddcb4097134ff3c332f>
+    <TaxCatchAll xmlns="76985e77-3742-43e1-98a7-928e24c9a13a" xsi:nil="true"/>
+  </documentManagement>
+</p:properties>
 </file>
 
 <file path=customXml/item2.xml><?xml version="1.0" encoding="utf-8"?>
-<b:Sources xmlns:b="http://schemas.openxmlformats.org/officeDocument/2006/bibliography" xmlns="http://schemas.openxmlformats.org/officeDocument/2006/bibliography" SelectedStyle="\APASixthEditionOfficeOnline.xsl" StyleName="APA" Version="6"/>
-</file>
-
-<file path=customXml/item3.xml><?xml version="1.0" encoding="utf-8"?>
 <ct:contentTypeSchema xmlns:ct="http://schemas.microsoft.com/office/2006/metadata/contentType" xmlns:ma="http://schemas.microsoft.com/office/2006/metadata/properties/metaAttributes" ct:_="" ma:_="" ma:contentTypeName="Document" ma:contentTypeID="0x01010008A9442D164A214FB75658819F99AF85" ma:contentTypeVersion="10" ma:contentTypeDescription="Crée un document." ma:contentTypeScope="" ma:versionID="81ed831bb7d06df50a5a3952d23cefd1">
   <xsd:schema xmlns:xsd="http://www.w3.org/2001/XMLSchema" xmlns:xs="http://www.w3.org/2001/XMLSchema" xmlns:p="http://schemas.microsoft.com/office/2006/metadata/properties" xmlns:ns2="e92e7415-81cb-47b8-a844-76566823e5a2" xmlns:ns3="76985e77-3742-43e1-98a7-928e24c9a13a" targetNamespace="http://schemas.microsoft.com/office/2006/metadata/properties" ma:root="true" ma:fieldsID="f124560c73ff02b20ce31e9c632ac72a" ns2:_="" ns3:_="">
     <xsd:import namespace="e92e7415-81cb-47b8-a844-76566823e5a2"/>
@@ -14119,34 +12227,31 @@
 </ct:contentTypeSchema>
 </file>
 
+<file path=customXml/item3.xml><?xml version="1.0" encoding="utf-8"?>
+<b:Sources xmlns:b="http://schemas.openxmlformats.org/officeDocument/2006/bibliography" xmlns="http://schemas.openxmlformats.org/officeDocument/2006/bibliography" SelectedStyle="\APASixthEditionOfficeOnline.xsl" StyleName="APA" Version="6"/>
+</file>
+
 <file path=customXml/item4.xml><?xml version="1.0" encoding="utf-8"?>
-<p:properties xmlns:p="http://schemas.microsoft.com/office/2006/metadata/properties" xmlns:xsi="http://www.w3.org/2001/XMLSchema-instance" xmlns:pc="http://schemas.microsoft.com/office/infopath/2007/PartnerControls">
-  <documentManagement>
-    <lcf76f155ced4ddcb4097134ff3c332f xmlns="e92e7415-81cb-47b8-a844-76566823e5a2">
-      <Terms xmlns="http://schemas.microsoft.com/office/infopath/2007/PartnerControls"/>
-    </lcf76f155ced4ddcb4097134ff3c332f>
-    <TaxCatchAll xmlns="76985e77-3742-43e1-98a7-928e24c9a13a" xsi:nil="true"/>
-  </documentManagement>
-</p:properties>
+<?mso-contentType ?>
+<FormTemplates xmlns="http://schemas.microsoft.com/sharepoint/v3/contenttype/forms">
+  <Display>DocumentLibraryForm</Display>
+  <Edit>DocumentLibraryForm</Edit>
+  <New>DocumentLibraryForm</New>
+</FormTemplates>
 </file>
 
 <file path=customXml/itemProps1.xml><?xml version="1.0" encoding="utf-8"?>
-<ds:datastoreItem xmlns:ds="http://schemas.openxmlformats.org/officeDocument/2006/customXml" ds:itemID="{0DCA1697-5CD9-437D-B9BC-9BFCE3AF93A4}">
+<ds:datastoreItem xmlns:ds="http://schemas.openxmlformats.org/officeDocument/2006/customXml" ds:itemID="{A22EAF01-3D16-467F-8DDD-2C461BA30656}">
   <ds:schemaRefs>
-    <ds:schemaRef ds:uri="http://schemas.microsoft.com/sharepoint/v3/contenttype/forms"/>
+    <ds:schemaRef ds:uri="http://schemas.microsoft.com/office/2006/metadata/properties"/>
+    <ds:schemaRef ds:uri="http://schemas.microsoft.com/office/infopath/2007/PartnerControls"/>
+    <ds:schemaRef ds:uri="e92e7415-81cb-47b8-a844-76566823e5a2"/>
+    <ds:schemaRef ds:uri="76985e77-3742-43e1-98a7-928e24c9a13a"/>
   </ds:schemaRefs>
 </ds:datastoreItem>
 </file>
 
 <file path=customXml/itemProps2.xml><?xml version="1.0" encoding="utf-8"?>
-<ds:datastoreItem xmlns:ds="http://schemas.openxmlformats.org/officeDocument/2006/customXml" ds:itemID="{319904BF-A50D-470D-BE36-B282CAE1E3EE}">
-  <ds:schemaRefs>
-    <ds:schemaRef ds:uri="http://schemas.openxmlformats.org/officeDocument/2006/bibliography"/>
-  </ds:schemaRefs>
-</ds:datastoreItem>
-</file>
-
-<file path=customXml/itemProps3.xml><?xml version="1.0" encoding="utf-8"?>
 <ds:datastoreItem xmlns:ds="http://schemas.openxmlformats.org/officeDocument/2006/customXml" ds:itemID="{EF67A5E2-9999-42AF-AE03-90AFDB20F4AE}">
   <ds:schemaRefs>
     <ds:schemaRef ds:uri="http://schemas.microsoft.com/office/2006/metadata/contentType"/>
@@ -14165,13 +12270,18 @@
 </ds:datastoreItem>
 </file>
 
+<file path=customXml/itemProps3.xml><?xml version="1.0" encoding="utf-8"?>
+<ds:datastoreItem xmlns:ds="http://schemas.openxmlformats.org/officeDocument/2006/customXml" ds:itemID="{319904BF-A50D-470D-BE36-B282CAE1E3EE}">
+  <ds:schemaRefs>
+    <ds:schemaRef ds:uri="http://schemas.openxmlformats.org/officeDocument/2006/bibliography"/>
+  </ds:schemaRefs>
+</ds:datastoreItem>
+</file>
+
 <file path=customXml/itemProps4.xml><?xml version="1.0" encoding="utf-8"?>
-<ds:datastoreItem xmlns:ds="http://schemas.openxmlformats.org/officeDocument/2006/customXml" ds:itemID="{A22EAF01-3D16-467F-8DDD-2C461BA30656}">
+<ds:datastoreItem xmlns:ds="http://schemas.openxmlformats.org/officeDocument/2006/customXml" ds:itemID="{0DCA1697-5CD9-437D-B9BC-9BFCE3AF93A4}">
   <ds:schemaRefs>
-    <ds:schemaRef ds:uri="http://schemas.microsoft.com/office/2006/metadata/properties"/>
-    <ds:schemaRef ds:uri="http://schemas.microsoft.com/office/infopath/2007/PartnerControls"/>
-    <ds:schemaRef ds:uri="e92e7415-81cb-47b8-a844-76566823e5a2"/>
-    <ds:schemaRef ds:uri="76985e77-3742-43e1-98a7-928e24c9a13a"/>
+    <ds:schemaRef ds:uri="http://schemas.microsoft.com/sharepoint/v3/contenttype/forms"/>
   </ds:schemaRefs>
 </ds:datastoreItem>
 </file>
</xml_diff>